<commit_message>
ICON Squads + RIMRIFT
</commit_message>
<xml_diff>
--- a/PATCH_NOTES_v0.4.8.6.docx
+++ b/PATCH_NOTES_v0.4.8.6.docx
@@ -1006,6 +1006,722 @@
           <w:szCs w:val="19"/>
         </w:rPr>
         <w:t xml:space="preserve">(Tests: 179 Python and 462 node tests. Browser checks covered the title screen (mouse, keyboard and controller, fresh presses only, the launcher heartbeat and lock-in), the welcome card, home, MyPlayer, the store, Settings, the Park screen, Pro-Am, a park and a game HUD, and the results screen. They also covered the arena from four cameras, a team arena (unchanged), the rebranded gear on a player, and the logo and icons at 16, 32 and 64 px. The traced logo matches the original artwork at an overlap of 0.99 for each color.)</w:t>
+      </w:r>
+    </w:p>
+    <w:p>
+      <w:pPr>
+        <w:pBdr>
+          <w:bottom w:val="single" w:color="D0D7DE" w:sz="4" w:space="1"/>
+        </w:pBdr>
+        <w:spacing w:after="160" w:before="80"/>
+      </w:pPr>
+    </w:p>
+    <w:p>
+      <w:pPr>
+        <w:pStyle w:val="Heading1"/>
+        <w:spacing w:after="120" w:before="280"/>
+      </w:pPr>
+      <w:r>
+        <w:rPr>
+          <w:rFonts w:ascii="Calibri" w:cs="Calibri" w:eastAsia="Calibri" w:hAnsi="Calibri"/>
+          <w:b/>
+          <w:bCs/>
+          <w:color w:val="C8102E"/>
+          <w:sz w:val="32"/>
+          <w:szCs w:val="32"/>
+        </w:rPr>
+        <w:t xml:space="preserve">Quick patch (Oct 18): The ICON Squad, Brick Wall and Posterizer</w:t>
+      </w:r>
+    </w:p>
+    <w:p>
+      <w:pPr>
+        <w:spacing w:after="140" w:line="288"/>
+      </w:pPr>
+      <w:r>
+        <w:rPr>
+          <w:rFonts w:ascii="Calibri" w:cs="Calibri" w:eastAsia="Calibri" w:hAnsi="Calibri"/>
+          <w:color w:val="1F2328"/>
+        </w:rPr>
+        <w:t xml:space="preserve">The rarest thing in the park. About every 12 hours, a full squad of three AI ICONs (99 OVR) shows up at one of the three parks and runs there for an hour.</w:t>
+      </w:r>
+    </w:p>
+    <w:p>
+      <w:pPr>
+        <w:pStyle w:val="Heading2"/>
+        <w:spacing w:after="80" w:before="200"/>
+      </w:pPr>
+      <w:r>
+        <w:rPr>
+          <w:rFonts w:ascii="Calibri" w:cs="Calibri" w:eastAsia="Calibri" w:hAnsi="Calibri"/>
+          <w:b/>
+          <w:bCs/>
+          <w:color w:val="1F2328"/>
+          <w:sz w:val="26"/>
+          <w:szCs w:val="26"/>
+        </w:rPr>
+        <w:t xml:space="preserve">When and where</w:t>
+      </w:r>
+    </w:p>
+    <w:p>
+      <w:pPr>
+        <w:pStyle w:val="ListParagraph"/>
+        <w:numPr>
+          <w:ilvl w:val="0"/>
+          <w:numId w:val="2"/>
+        </w:numPr>
+        <w:spacing w:after="80" w:line="276"/>
+      </w:pPr>
+      <w:r>
+        <w:rPr>
+          <w:rFonts w:ascii="Calibri" w:cs="Calibri" w:eastAsia="Calibri" w:hAnsi="Calibri"/>
+          <w:b/>
+          <w:bCs/>
+          <w:color w:val="1F2328"/>
+        </w:rPr>
+        <w:t xml:space="preserve">Every 12 hours plus 10 to 30 minutes.</w:t>
+      </w:r>
+      <w:r>
+        <w:rPr>
+          <w:rFonts w:ascii="Calibri" w:cs="Calibri" w:eastAsia="Calibri" w:hAnsi="Calibri"/>
+          <w:color w:val="1F2328"/>
+        </w:rPr>
+        <w:t xml:space="preserve"> Each squad arrives 12 hours and 10 to 30 minutes after the last one did, a different amount every time. It never comes sooner than 12 hours, and it lands about 40 minutes later each day, so over a few weeks it visits every hour of the day.</w:t>
+      </w:r>
+    </w:p>
+    <w:p>
+      <w:pPr>
+        <w:pStyle w:val="ListParagraph"/>
+        <w:numPr>
+          <w:ilvl w:val="0"/>
+          <w:numId w:val="2"/>
+        </w:numPr>
+        <w:spacing w:after="80" w:line="276"/>
+      </w:pPr>
+      <w:r>
+        <w:rPr>
+          <w:rFonts w:ascii="Calibri" w:cs="Calibri" w:eastAsia="Calibri" w:hAnsi="Calibri"/>
+          <w:b/>
+          <w:bCs/>
+          <w:color w:val="1F2328"/>
+        </w:rPr>
+        <w:t xml:space="preserve">Harbor Point, Old Brick Yard or Foundry Works,</w:t>
+      </w:r>
+      <w:r>
+        <w:rPr>
+          <w:rFonts w:ascii="Calibri" w:cs="Calibri" w:eastAsia="Calibri" w:hAnsi="Calibri"/>
+          <w:color w:val="1F2328"/>
+        </w:rPr>
+        <w:t xml:space="preserve"> never the same park twice in a row.</w:t>
+      </w:r>
+    </w:p>
+    <w:p>
+      <w:pPr>
+        <w:pStyle w:val="ListParagraph"/>
+        <w:numPr>
+          <w:ilvl w:val="0"/>
+          <w:numId w:val="2"/>
+        </w:numPr>
+        <w:spacing w:after="80" w:line="276"/>
+      </w:pPr>
+      <w:r>
+        <w:rPr>
+          <w:rFonts w:ascii="Calibri" w:cs="Calibri" w:eastAsia="Calibri" w:hAnsi="Calibri"/>
+          <w:b/>
+          <w:bCs/>
+          <w:color w:val="1F2328"/>
+        </w:rPr>
+        <w:t xml:space="preserve">Only ever one.</w:t>
+      </w:r>
+      <w:r>
+        <w:rPr>
+          <w:rFonts w:ascii="Calibri" w:cs="Calibri" w:eastAsia="Calibri" w:hAnsi="Calibri"/>
+          <w:color w:val="1F2328"/>
+        </w:rPr>
+        <w:t xml:space="preserve"> There is one ICON Squad at a time across the three parks, and no other AI team in the parks ever has three ICONs on it.</w:t>
+      </w:r>
+    </w:p>
+    <w:p>
+      <w:pPr>
+        <w:pStyle w:val="ListParagraph"/>
+        <w:numPr>
+          <w:ilvl w:val="0"/>
+          <w:numId w:val="2"/>
+        </w:numPr>
+        <w:spacing w:after="80" w:line="276"/>
+      </w:pPr>
+      <w:r>
+        <w:rPr>
+          <w:rFonts w:ascii="Calibri" w:cs="Calibri" w:eastAsia="Calibri" w:hAnsi="Calibri"/>
+          <w:b/>
+          <w:bCs/>
+          <w:color w:val="1F2328"/>
+        </w:rPr>
+        <w:t xml:space="preserve">The same schedule for everyone.</w:t>
+      </w:r>
+      <w:r>
+        <w:rPr>
+          <w:rFonts w:ascii="Calibri" w:cs="Calibri" w:eastAsia="Calibri" w:hAnsi="Calibri"/>
+          <w:color w:val="1F2328"/>
+        </w:rPr>
+        <w:t xml:space="preserve"> It runs on the server's clock, so every copy of the game sees the squad arrive at the same moment, at the same park.</w:t>
+      </w:r>
+    </w:p>
+    <w:p>
+      <w:pPr>
+        <w:pStyle w:val="ListParagraph"/>
+        <w:numPr>
+          <w:ilvl w:val="0"/>
+          <w:numId w:val="2"/>
+        </w:numPr>
+        <w:spacing w:after="80" w:line="276"/>
+      </w:pPr>
+      <w:r>
+        <w:rPr>
+          <w:rFonts w:ascii="Calibri" w:cs="Calibri" w:eastAsia="Calibri" w:hAnsi="Calibri"/>
+          <w:b/>
+          <w:bCs/>
+          <w:color w:val="1F2328"/>
+        </w:rPr>
+        <w:t xml:space="preserve">There's no countdown.</w:t>
+      </w:r>
+      <w:r>
+        <w:rPr>
+          <w:rFonts w:ascii="Calibri" w:cs="Calibri" w:eastAsia="Calibri" w:hAnsi="Calibri"/>
+          <w:color w:val="1F2328"/>
+        </w:rPr>
+        <w:t xml:space="preserve"> You find out when they show up.</w:t>
+      </w:r>
+    </w:p>
+    <w:p>
+      <w:pPr>
+        <w:pStyle w:val="Heading2"/>
+        <w:spacing w:after="80" w:before="200"/>
+      </w:pPr>
+      <w:r>
+        <w:rPr>
+          <w:rFonts w:ascii="Calibri" w:cs="Calibri" w:eastAsia="Calibri" w:hAnsi="Calibri"/>
+          <w:b/>
+          <w:bCs/>
+          <w:color w:val="1F2328"/>
+          <w:sz w:val="26"/>
+          <w:szCs w:val="26"/>
+        </w:rPr>
+        <w:t xml:space="preserve">Who they are</w:t>
+      </w:r>
+    </w:p>
+    <w:p>
+      <w:pPr>
+        <w:pStyle w:val="ListParagraph"/>
+        <w:numPr>
+          <w:ilvl w:val="0"/>
+          <w:numId w:val="2"/>
+        </w:numPr>
+        <w:spacing w:after="80" w:line="276"/>
+      </w:pPr>
+      <w:r>
+        <w:rPr>
+          <w:rFonts w:ascii="Calibri" w:cs="Calibri" w:eastAsia="Calibri" w:hAnsi="Calibri"/>
+          <w:b/>
+          <w:bCs/>
+          <w:color w:val="1F2328"/>
+        </w:rPr>
+        <w:t xml:space="preserve">Three real ICONs of your world:</w:t>
+      </w:r>
+      <w:r>
+        <w:rPr>
+          <w:rFonts w:ascii="Calibri" w:cs="Calibri" w:eastAsia="Calibri" w:hAnsi="Calibri"/>
+          <w:color w:val="1F2328"/>
+        </w:rPr>
+        <w:t xml:space="preserve"> AI hoopers who got to 99 by the same rules you do. Nobody is made an ICON for the occasion.</w:t>
+      </w:r>
+    </w:p>
+    <w:p>
+      <w:pPr>
+        <w:pStyle w:val="ListParagraph"/>
+        <w:numPr>
+          <w:ilvl w:val="0"/>
+          <w:numId w:val="2"/>
+        </w:numPr>
+        <w:spacing w:after="80" w:line="276"/>
+      </w:pPr>
+      <w:r>
+        <w:rPr>
+          <w:rFonts w:ascii="Calibri" w:cs="Calibri" w:eastAsia="Calibri" w:hAnsi="Calibri"/>
+          <w:b/>
+          <w:bCs/>
+          <w:color w:val="1F2328"/>
+        </w:rPr>
+        <w:t xml:space="preserve">Builds that fit together:</w:t>
+      </w:r>
+      <w:r>
+        <w:rPr>
+          <w:rFonts w:ascii="Calibri" w:cs="Calibri" w:eastAsia="Calibri" w:hAnsi="Calibri"/>
+          <w:color w:val="1F2328"/>
+        </w:rPr>
+        <w:t xml:space="preserve"> a ball handler, a wing and a big, on three different archetypes that cover playmaking, shooting, inside scoring and defense between them. Most squads are a new mix of ICONs.</w:t>
+      </w:r>
+    </w:p>
+    <w:p>
+      <w:pPr>
+        <w:pStyle w:val="ListParagraph"/>
+        <w:numPr>
+          <w:ilvl w:val="0"/>
+          <w:numId w:val="2"/>
+        </w:numPr>
+        <w:spacing w:after="80" w:line="276"/>
+      </w:pPr>
+      <w:r>
+        <w:rPr>
+          <w:rFonts w:ascii="Calibri" w:cs="Calibri" w:eastAsia="Calibri" w:hAnsi="Calibri"/>
+          <w:b/>
+          <w:bCs/>
+          <w:color w:val="1F2328"/>
+        </w:rPr>
+        <w:t xml:space="preserve">One outfit:</w:t>
+      </w:r>
+      <w:r>
+        <w:rPr>
+          <w:rFonts w:ascii="Calibri" w:cs="Calibri" w:eastAsia="Calibri" w:hAnsi="Calibri"/>
+          <w:color w:val="1F2328"/>
+        </w:rPr>
+        <w:t xml:space="preserve"> the squad leader's clothes, worn by all three. An exclusive only goes on if all three have unlocked it. Each keeps his own name, number, animations and Icon package.</w:t>
+      </w:r>
+    </w:p>
+    <w:p>
+      <w:pPr>
+        <w:pStyle w:val="ListParagraph"/>
+        <w:numPr>
+          <w:ilvl w:val="0"/>
+          <w:numId w:val="2"/>
+        </w:numPr>
+        <w:spacing w:after="80" w:line="276"/>
+      </w:pPr>
+      <w:r>
+        <w:rPr>
+          <w:rFonts w:ascii="Calibri" w:cs="Calibri" w:eastAsia="Calibri" w:hAnsi="Calibri"/>
+          <w:b/>
+          <w:bCs/>
+          <w:color w:val="1F2328"/>
+        </w:rPr>
+        <w:t xml:space="preserve">A young world has to wait.</w:t>
+      </w:r>
+      <w:r>
+        <w:rPr>
+          <w:rFonts w:ascii="Calibri" w:cs="Calibri" w:eastAsia="Calibri" w:hAnsi="Calibri"/>
+          <w:color w:val="1F2328"/>
+        </w:rPr>
+        <w:t xml:space="preserve"> A world needs three ICONs before a squad can form, which takes about six to eight weeks. Until then, the hour passes with no squad.</w:t>
+      </w:r>
+    </w:p>
+    <w:p>
+      <w:pPr>
+        <w:pStyle w:val="Heading2"/>
+        <w:spacing w:after="80" w:before="200"/>
+      </w:pPr>
+      <w:r>
+        <w:rPr>
+          <w:rFonts w:ascii="Calibri" w:cs="Calibri" w:eastAsia="Calibri" w:hAnsi="Calibri"/>
+          <w:b/>
+          <w:bCs/>
+          <w:color w:val="1F2328"/>
+          <w:sz w:val="26"/>
+          <w:szCs w:val="26"/>
+        </w:rPr>
+        <w:t xml:space="preserve">At the park</w:t>
+      </w:r>
+    </w:p>
+    <w:p>
+      <w:pPr>
+        <w:pStyle w:val="ListParagraph"/>
+        <w:numPr>
+          <w:ilvl w:val="0"/>
+          <w:numId w:val="2"/>
+        </w:numPr>
+        <w:spacing w:after="80" w:line="276"/>
+      </w:pPr>
+      <w:r>
+        <w:rPr>
+          <w:rFonts w:ascii="Calibri" w:cs="Calibri" w:eastAsia="Calibri" w:hAnsi="Calibri"/>
+          <w:b/>
+          <w:bCs/>
+          <w:color w:val="1F2328"/>
+        </w:rPr>
+        <w:t xml:space="preserve">They walk in together</w:t>
+      </w:r>
+      <w:r>
+        <w:rPr>
+          <w:rFonts w:ascii="Calibri" w:cs="Calibri" w:eastAsia="Calibri" w:hAnsi="Calibri"/>
+          <w:color w:val="1F2328"/>
+        </w:rPr>
+        <w:t xml:space="preserve"> and take a 3v3 court, or a GOT NEXT spot as a group.</w:t>
+      </w:r>
+    </w:p>
+    <w:p>
+      <w:pPr>
+        <w:pStyle w:val="ListParagraph"/>
+        <w:numPr>
+          <w:ilvl w:val="0"/>
+          <w:numId w:val="2"/>
+        </w:numPr>
+        <w:spacing w:after="80" w:line="276"/>
+      </w:pPr>
+      <w:r>
+        <w:rPr>
+          <w:rFonts w:ascii="Calibri" w:cs="Calibri" w:eastAsia="Calibri" w:hAnsi="Calibri"/>
+          <w:b/>
+          <w:bCs/>
+          <w:color w:val="1F2328"/>
+        </w:rPr>
+        <w:t xml:space="preserve">Winners stay.</w:t>
+      </w:r>
+      <w:r>
+        <w:rPr>
+          <w:rFonts w:ascii="Calibri" w:cs="Calibri" w:eastAsia="Calibri" w:hAnsi="Calibri"/>
+          <w:color w:val="1F2328"/>
+        </w:rPr>
+        <w:t xml:space="preserve"> They keep the court while they win. Beat them and they get back in line to run it again.</w:t>
+      </w:r>
+    </w:p>
+    <w:p>
+      <w:pPr>
+        <w:pStyle w:val="ListParagraph"/>
+        <w:numPr>
+          <w:ilvl w:val="0"/>
+          <w:numId w:val="2"/>
+        </w:numPr>
+        <w:spacing w:after="80" w:line="276"/>
+      </w:pPr>
+      <w:r>
+        <w:rPr>
+          <w:rFonts w:ascii="Calibri" w:cs="Calibri" w:eastAsia="Calibri" w:hAnsi="Calibri"/>
+          <w:b/>
+          <w:bCs/>
+          <w:color w:val="1F2328"/>
+        </w:rPr>
+        <w:t xml:space="preserve">To play them,</w:t>
+      </w:r>
+      <w:r>
+        <w:rPr>
+          <w:rFonts w:ascii="Calibri" w:cs="Calibri" w:eastAsia="Calibri" w:hAnsi="Calibri"/>
+          <w:color w:val="1F2328"/>
+        </w:rPr>
+        <w:t xml:space="preserve"> get next on their court.</w:t>
+      </w:r>
+    </w:p>
+    <w:p>
+      <w:pPr>
+        <w:pStyle w:val="ListParagraph"/>
+        <w:numPr>
+          <w:ilvl w:val="0"/>
+          <w:numId w:val="2"/>
+        </w:numPr>
+        <w:spacing w:after="80" w:line="276"/>
+      </w:pPr>
+      <w:r>
+        <w:rPr>
+          <w:rFonts w:ascii="Calibri" w:cs="Calibri" w:eastAsia="Calibri" w:hAnsi="Calibri"/>
+          <w:b/>
+          <w:bCs/>
+          <w:color w:val="1F2328"/>
+        </w:rPr>
+        <w:t xml:space="preserve">When the hour is up,</w:t>
+      </w:r>
+      <w:r>
+        <w:rPr>
+          <w:rFonts w:ascii="Calibri" w:cs="Calibri" w:eastAsia="Calibri" w:hAnsi="Calibri"/>
+          <w:color w:val="1F2328"/>
+        </w:rPr>
+        <w:t xml:space="preserve"> they finish the game they're in and walk out together.</w:t>
+      </w:r>
+    </w:p>
+    <w:p>
+      <w:pPr>
+        <w:pStyle w:val="ListParagraph"/>
+        <w:numPr>
+          <w:ilvl w:val="0"/>
+          <w:numId w:val="2"/>
+        </w:numPr>
+        <w:spacing w:after="80" w:line="276"/>
+      </w:pPr>
+      <w:r>
+        <w:rPr>
+          <w:rFonts w:ascii="Calibri" w:cs="Calibri" w:eastAsia="Calibri" w:hAnsi="Calibri"/>
+          <w:b/>
+          <w:bCs/>
+          <w:color w:val="1F2328"/>
+        </w:rPr>
+        <w:t xml:space="preserve">They're busy for the hour.</w:t>
+      </w:r>
+      <w:r>
+        <w:rPr>
+          <w:rFonts w:ascii="Calibri" w:cs="Calibri" w:eastAsia="Calibri" w:hAnsi="Calibri"/>
+          <w:color w:val="1F2328"/>
+        </w:rPr>
+        <w:t xml:space="preserve"> You can't invite one of them to your squad. One who's in your squad leaves to run with them, and you can ask him back when their hour is over.</w:t>
+      </w:r>
+    </w:p>
+    <w:p>
+      <w:pPr>
+        <w:pStyle w:val="Heading2"/>
+        <w:spacing w:after="80" w:before="200"/>
+      </w:pPr>
+      <w:r>
+        <w:rPr>
+          <w:rFonts w:ascii="Calibri" w:cs="Calibri" w:eastAsia="Calibri" w:hAnsi="Calibri"/>
+          <w:b/>
+          <w:bCs/>
+          <w:color w:val="1F2328"/>
+          <w:sz w:val="26"/>
+          <w:szCs w:val="26"/>
+        </w:rPr>
+        <w:t xml:space="preserve">Where you'll see it</w:t>
+      </w:r>
+    </w:p>
+    <w:p>
+      <w:pPr>
+        <w:pStyle w:val="ListParagraph"/>
+        <w:numPr>
+          <w:ilvl w:val="0"/>
+          <w:numId w:val="2"/>
+        </w:numPr>
+        <w:spacing w:after="80" w:line="276"/>
+      </w:pPr>
+      <w:r>
+        <w:rPr>
+          <w:rFonts w:ascii="Calibri" w:cs="Calibri" w:eastAsia="Calibri" w:hAnsi="Calibri"/>
+          <w:b/>
+          <w:bCs/>
+          <w:color w:val="1F2328"/>
+        </w:rPr>
+        <w:t xml:space="preserve">A toast</w:t>
+      </w:r>
+      <w:r>
+        <w:rPr>
+          <w:rFonts w:ascii="Calibri" w:cs="Calibri" w:eastAsia="Calibri" w:hAnsi="Calibri"/>
+          <w:color w:val="1F2328"/>
+        </w:rPr>
+        <w:t xml:space="preserve"> when they show up, wherever you are in the menus or at another park.</w:t>
+      </w:r>
+    </w:p>
+    <w:p>
+      <w:pPr>
+        <w:pStyle w:val="ListParagraph"/>
+        <w:numPr>
+          <w:ilvl w:val="0"/>
+          <w:numId w:val="2"/>
+        </w:numPr>
+        <w:spacing w:after="80" w:line="276"/>
+      </w:pPr>
+      <w:r>
+        <w:rPr>
+          <w:rFonts w:ascii="Calibri" w:cs="Calibri" w:eastAsia="Calibri" w:hAnsi="Calibri"/>
+          <w:b/>
+          <w:bCs/>
+          <w:color w:val="1F2328"/>
+        </w:rPr>
+        <w:t xml:space="preserve">The Park screen</w:t>
+      </w:r>
+      <w:r>
+        <w:rPr>
+          <w:rFonts w:ascii="Calibri" w:cs="Calibri" w:eastAsia="Calibri" w:hAnsi="Calibri"/>
+          <w:color w:val="1F2328"/>
+        </w:rPr>
+        <w:t xml:space="preserve"> tags their park ICON SQUAD HERE with the time left and their names.</w:t>
+      </w:r>
+    </w:p>
+    <w:p>
+      <w:pPr>
+        <w:pStyle w:val="ListParagraph"/>
+        <w:numPr>
+          <w:ilvl w:val="0"/>
+          <w:numId w:val="2"/>
+        </w:numPr>
+        <w:spacing w:after="80" w:line="276"/>
+      </w:pPr>
+      <w:r>
+        <w:rPr>
+          <w:rFonts w:ascii="Calibri" w:cs="Calibri" w:eastAsia="Calibri" w:hAnsi="Calibri"/>
+          <w:b/>
+          <w:bCs/>
+          <w:color w:val="1F2328"/>
+        </w:rPr>
+        <w:t xml:space="preserve">The phone</w:t>
+      </w:r>
+      <w:r>
+        <w:rPr>
+          <w:rFonts w:ascii="Calibri" w:cs="Calibri" w:eastAsia="Calibri" w:hAnsi="Calibri"/>
+          <w:color w:val="1F2328"/>
+        </w:rPr>
+        <w:t xml:space="preserve"> shows an ICON SQUAD chip on each of them, and where they are.</w:t>
+      </w:r>
+    </w:p>
+    <w:p>
+      <w:pPr>
+        <w:pStyle w:val="ListParagraph"/>
+        <w:numPr>
+          <w:ilvl w:val="0"/>
+          <w:numId w:val="2"/>
+        </w:numPr>
+        <w:spacing w:after="80" w:line="276"/>
+      </w:pPr>
+      <w:r>
+        <w:rPr>
+          <w:rFonts w:ascii="Calibri" w:cs="Calibri" w:eastAsia="Calibri" w:hAnsi="Calibri"/>
+          <w:b/>
+          <w:bCs/>
+          <w:color w:val="1F2328"/>
+        </w:rPr>
+        <w:t xml:space="preserve">On the court and the scoreboard,</w:t>
+      </w:r>
+      <w:r>
+        <w:rPr>
+          <w:rFonts w:ascii="Calibri" w:cs="Calibri" w:eastAsia="Calibri" w:hAnsi="Calibri"/>
+          <w:color w:val="1F2328"/>
+        </w:rPr>
+        <w:t xml:space="preserve"> they play as the ICON Squad.</w:t>
+      </w:r>
+    </w:p>
+    <w:p>
+      <w:pPr>
+        <w:pStyle w:val="Heading2"/>
+        <w:spacing w:after="80" w:before="200"/>
+      </w:pPr>
+      <w:r>
+        <w:rPr>
+          <w:rFonts w:ascii="Calibri" w:cs="Calibri" w:eastAsia="Calibri" w:hAnsi="Calibri"/>
+          <w:b/>
+          <w:bCs/>
+          <w:color w:val="1F2328"/>
+          <w:sz w:val="26"/>
+          <w:szCs w:val="26"/>
+        </w:rPr>
+        <w:t xml:space="preserve">Badges</w:t>
+      </w:r>
+    </w:p>
+    <w:p>
+      <w:pPr>
+        <w:pStyle w:val="ListParagraph"/>
+        <w:numPr>
+          <w:ilvl w:val="0"/>
+          <w:numId w:val="2"/>
+        </w:numPr>
+        <w:spacing w:after="80" w:line="276"/>
+      </w:pPr>
+      <w:r>
+        <w:rPr>
+          <w:rFonts w:ascii="Calibri" w:cs="Calibri" w:eastAsia="Calibri" w:hAnsi="Calibri"/>
+          <w:b/>
+          <w:bCs/>
+          <w:color w:val="1F2328"/>
+        </w:rPr>
+        <w:t xml:space="preserve">Brick Wall:</w:t>
+      </w:r>
+      <w:r>
+        <w:rPr>
+          <w:rFonts w:ascii="Calibri" w:cs="Calibri" w:eastAsia="Calibri" w:hAnsi="Calibri"/>
+          <w:color w:val="1F2328"/>
+        </w:rPr>
+        <w:t xml:space="preserve"> Hall of Fame takes </w:t>
+      </w:r>
+      <w:r>
+        <w:rPr>
+          <w:rFonts w:ascii="Calibri" w:cs="Calibri" w:eastAsia="Calibri" w:hAnsi="Calibri"/>
+          <w:b/>
+          <w:bCs/>
+          <w:color w:val="1F2328"/>
+        </w:rPr>
+        <w:t xml:space="preserve">173 successful screens</w:t>
+      </w:r>
+      <w:r>
+        <w:rPr>
+          <w:rFonts w:ascii="Calibri" w:cs="Calibri" w:eastAsia="Calibri" w:hAnsi="Calibri"/>
+          <w:color w:val="1F2328"/>
+        </w:rPr>
+        <w:t xml:space="preserve"> (was 315, 45% fewer). Bronze, Silver and Gold are unchanged (18, 63 and 154).</w:t>
+      </w:r>
+    </w:p>
+    <w:p>
+      <w:pPr>
+        <w:pStyle w:val="ListParagraph"/>
+        <w:numPr>
+          <w:ilvl w:val="0"/>
+          <w:numId w:val="2"/>
+        </w:numPr>
+        <w:spacing w:after="80" w:line="276"/>
+      </w:pPr>
+      <w:r>
+        <w:rPr>
+          <w:rFonts w:ascii="Calibri" w:cs="Calibri" w:eastAsia="Calibri" w:hAnsi="Calibri"/>
+          <w:b/>
+          <w:bCs/>
+          <w:color w:val="1F2328"/>
+        </w:rPr>
+        <w:t xml:space="preserve">Posterizer:</w:t>
+      </w:r>
+      <w:r>
+        <w:rPr>
+          <w:rFonts w:ascii="Calibri" w:cs="Calibri" w:eastAsia="Calibri" w:hAnsi="Calibri"/>
+          <w:color w:val="1F2328"/>
+        </w:rPr>
+        <w:t xml:space="preserve"> Hall of Fame takes </w:t>
+      </w:r>
+      <w:r>
+        <w:rPr>
+          <w:rFonts w:ascii="Calibri" w:cs="Calibri" w:eastAsia="Calibri" w:hAnsi="Calibri"/>
+          <w:b/>
+          <w:bCs/>
+          <w:color w:val="1F2328"/>
+        </w:rPr>
+        <w:t xml:space="preserve">126 dunks</w:t>
+      </w:r>
+      <w:r>
+        <w:rPr>
+          <w:rFonts w:ascii="Calibri" w:cs="Calibri" w:eastAsia="Calibri" w:hAnsi="Calibri"/>
+          <w:color w:val="1F2328"/>
+        </w:rPr>
+        <w:t xml:space="preserve"> (was 180, 30% fewer). Bronze, Silver and Gold are unchanged (8, 30 and 80).</w:t>
+      </w:r>
+    </w:p>
+    <w:p>
+      <w:pPr>
+        <w:pStyle w:val="ListParagraph"/>
+        <w:numPr>
+          <w:ilvl w:val="0"/>
+          <w:numId w:val="2"/>
+        </w:numPr>
+        <w:spacing w:after="80" w:line="276"/>
+      </w:pPr>
+      <w:r>
+        <w:rPr>
+          <w:rFonts w:ascii="Calibri" w:cs="Calibri" w:eastAsia="Calibri" w:hAnsi="Calibri"/>
+          <w:b/>
+          <w:bCs/>
+          <w:color w:val="1F2328"/>
+        </w:rPr>
+        <w:t xml:space="preserve">Progress you've already made counts.</w:t>
+      </w:r>
+      <w:r>
+        <w:rPr>
+          <w:rFonts w:ascii="Calibri" w:cs="Calibri" w:eastAsia="Calibri" w:hAnsi="Calibri"/>
+          <w:color w:val="1F2328"/>
+        </w:rPr>
+        <w:t xml:space="preserve"> A build already past the new mark moves up to Hall of Fame as soon as you log in, if the badge can reach Hall of Fame on that build and it has a Hall of Fame slot free.</w:t>
+      </w:r>
+    </w:p>
+    <w:p>
+      <w:pPr>
+        <w:spacing w:after="140" w:line="288"/>
+      </w:pPr>
+      <w:r>
+        <w:rPr>
+          <w:rFonts w:ascii="Calibri" w:cs="Calibri" w:eastAsia="Calibri" w:hAnsi="Calibri"/>
+          <w:i/>
+          <w:iCs/>
+          <w:color w:val="57606A"/>
+          <w:sz w:val="19"/>
+          <w:szCs w:val="19"/>
+        </w:rPr>
+        <w:t xml:space="preserve">(Tests: 181 Python and 487 node tests. A browser check covered a year-old world with the clock moved into a squad's hour at the Old Brick Yard: the real pick, the toast, the Park screen tag, the squad holding a court in one outfit and the phone list, with no page errors. The one-squad rule was checked over 3,200 random park steps with half the AI as ICONs: no other team ever had more than two.)</w:t>
       </w:r>
     </w:p>
     <w:sectPr>

</xml_diff>

<commit_message>
QP for ICON SQUADS
</commit_message>
<xml_diff>
--- a/PATCH_NOTES_v0.4.8.6.docx
+++ b/PATCH_NOTES_v0.4.8.6.docx
@@ -1042,7 +1042,7 @@
           <w:rFonts w:ascii="Calibri" w:cs="Calibri" w:eastAsia="Calibri" w:hAnsi="Calibri"/>
           <w:color w:val="1F2328"/>
         </w:rPr>
-        <w:t xml:space="preserve">The rarest thing in the park. About every 12 hours, a full squad of three AI ICONs (99 OVR) shows up at one of the three parks and runs there for an hour.</w:t>
+        <w:t xml:space="preserve">The rarest thing in the park. About every 9 hours, a full squad of three AI ICONs (99 OVR) shows up at one of the three parks and runs there for an hour.</w:t>
       </w:r>
     </w:p>
     <w:p>
@@ -1078,14 +1078,14 @@
           <w:bCs/>
           <w:color w:val="1F2328"/>
         </w:rPr>
-        <w:t xml:space="preserve">Every 12 hours plus 10 to 30 minutes.</w:t>
-      </w:r>
-      <w:r>
-        <w:rPr>
-          <w:rFonts w:ascii="Calibri" w:cs="Calibri" w:eastAsia="Calibri" w:hAnsi="Calibri"/>
-          <w:color w:val="1F2328"/>
-        </w:rPr>
-        <w:t xml:space="preserve"> Each squad arrives 12 hours and 10 to 30 minutes after the last one did, a different amount every time. It never comes sooner than 12 hours, and it lands about 40 minutes later each day, so over a few weeks it visits every hour of the day.</w:t>
+        <w:t xml:space="preserve">Every 9 hours, give or take 10 to 30 minutes.</w:t>
+      </w:r>
+      <w:r>
+        <w:rPr>
+          <w:rFonts w:ascii="Calibri" w:cs="Calibri" w:eastAsia="Calibri" w:hAnsi="Calibri"/>
+          <w:color w:val="1F2328"/>
+        </w:rPr>
+        <w:t xml:space="preserve"> Each squad arrives about 9 hours after the last one did, 10 to 30 minutes early or late, a different amount every time. Nine hours doesn't divide a day, so it comes round at every hour of the day.</w:t>
       </w:r>
     </w:p>
     <w:p>

</xml_diff>

<commit_message>
Account Reset & Startup Overhaul - Road to v0.5
</commit_message>
<xml_diff>
--- a/PATCH_NOTES_v0.4.8.6.docx
+++ b/PATCH_NOTES_v0.4.8.6.docx
@@ -1030,7 +1030,427 @@
           <w:sz w:val="32"/>
           <w:szCs w:val="32"/>
         </w:rPr>
-        <w:t xml:space="preserve">Quick patch (Oct 18): The ICON Squad, Brick Wall and Posterizer</w:t>
+        <w:t xml:space="preserve">Quick patch (Oct 18): The season reset, the ICON Squad, Brick Wall and Posterizer</w:t>
+      </w:r>
+    </w:p>
+    <w:p>
+      <w:pPr>
+        <w:pStyle w:val="Heading2"/>
+        <w:spacing w:after="80" w:before="200"/>
+      </w:pPr>
+      <w:r>
+        <w:rPr>
+          <w:rFonts w:ascii="Calibri" w:cs="Calibri" w:eastAsia="Calibri" w:hAnsi="Calibri"/>
+          <w:b/>
+          <w:bCs/>
+          <w:color w:val="1F2328"/>
+          <w:sz w:val="26"/>
+          <w:szCs w:val="26"/>
+        </w:rPr>
+        <w:t xml:space="preserve">The season reset: Monday Oct 19, 12:00 AM Eastern</w:t>
+      </w:r>
+    </w:p>
+    <w:p>
+      <w:pPr>
+        <w:spacing w:after="140" w:line="288"/>
+      </w:pPr>
+      <w:r>
+        <w:rPr>
+          <w:rFonts w:ascii="Calibri" w:cs="Calibri" w:eastAsia="Calibri" w:hAnsi="Calibri"/>
+          <w:color w:val="1F2328"/>
+        </w:rPr>
+        <w:t xml:space="preserve">Every account starts over at midnight Eastern going into Monday, October 19 (9:00 PM Pacific on Sunday, 04:00 UTC).</w:t>
+      </w:r>
+    </w:p>
+    <w:p>
+      <w:pPr>
+        <w:pStyle w:val="ListParagraph"/>
+        <w:numPr>
+          <w:ilvl w:val="0"/>
+          <w:numId w:val="2"/>
+        </w:numPr>
+        <w:spacing w:after="80" w:line="276"/>
+      </w:pPr>
+      <w:r>
+        <w:rPr>
+          <w:rFonts w:ascii="Calibri" w:cs="Calibri" w:eastAsia="Calibri" w:hAnsi="Calibri"/>
+          <w:b/>
+          <w:bCs/>
+          <w:color w:val="1F2328"/>
+        </w:rPr>
+        <w:t xml:space="preserve">Wiped:</w:t>
+      </w:r>
+    </w:p>
+    <w:p>
+      <w:pPr>
+        <w:pStyle w:val="ListParagraph"/>
+        <w:numPr>
+          <w:ilvl w:val="1"/>
+          <w:numId w:val="2"/>
+        </w:numPr>
+        <w:spacing w:after="80" w:line="276"/>
+      </w:pPr>
+      <w:r>
+        <w:rPr>
+          <w:rFonts w:ascii="Calibri" w:cs="Calibri" w:eastAsia="Calibri" w:hAnsi="Calibri"/>
+          <w:color w:val="1F2328"/>
+        </w:rPr>
+        <w:t xml:space="preserve">every build, with its games, its Pro Run career and its Pro-Am team;</w:t>
+      </w:r>
+    </w:p>
+    <w:p>
+      <w:pPr>
+        <w:pStyle w:val="ListParagraph"/>
+        <w:numPr>
+          <w:ilvl w:val="1"/>
+          <w:numId w:val="2"/>
+        </w:numPr>
+        <w:spacing w:after="80" w:line="276"/>
+      </w:pPr>
+      <w:r>
+        <w:rPr>
+          <w:rFonts w:ascii="Calibri" w:cs="Calibri" w:eastAsia="Calibri" w:hAnsi="Calibri"/>
+          <w:color w:val="1F2328"/>
+        </w:rPr>
+        <w:t xml:space="preserve">all your VC;</w:t>
+      </w:r>
+    </w:p>
+    <w:p>
+      <w:pPr>
+        <w:pStyle w:val="ListParagraph"/>
+        <w:numPr>
+          <w:ilvl w:val="1"/>
+          <w:numId w:val="2"/>
+        </w:numPr>
+        <w:spacing w:after="80" w:line="276"/>
+      </w:pPr>
+      <w:r>
+        <w:rPr>
+          <w:rFonts w:ascii="Calibri" w:cs="Calibri" w:eastAsia="Calibri" w:hAnsi="Calibri"/>
+          <w:color w:val="1F2328"/>
+        </w:rPr>
+        <w:t xml:space="preserve">every item: store, Daily Spin and event items;</w:t>
+      </w:r>
+    </w:p>
+    <w:p>
+      <w:pPr>
+        <w:pStyle w:val="ListParagraph"/>
+        <w:numPr>
+          <w:ilvl w:val="1"/>
+          <w:numId w:val="2"/>
+        </w:numPr>
+        <w:spacing w:after="80" w:line="276"/>
+      </w:pPr>
+      <w:r>
+        <w:rPr>
+          <w:rFonts w:ascii="Calibri" w:cs="Calibri" w:eastAsia="Calibri" w:hAnsi="Calibri"/>
+          <w:color w:val="1F2328"/>
+        </w:rPr>
+        <w:t xml:space="preserve">crews, which are disbanded and start over with no XP;</w:t>
+      </w:r>
+    </w:p>
+    <w:p>
+      <w:pPr>
+        <w:pStyle w:val="ListParagraph"/>
+        <w:numPr>
+          <w:ilvl w:val="1"/>
+          <w:numId w:val="2"/>
+        </w:numPr>
+        <w:spacing w:after="80" w:line="276"/>
+      </w:pPr>
+      <w:r>
+        <w:rPr>
+          <w:rFonts w:ascii="Calibri" w:cs="Calibri" w:eastAsia="Calibri" w:hAnsi="Calibri"/>
+          <w:color w:val="1F2328"/>
+        </w:rPr>
+        <w:t xml:space="preserve">event leaderboard entries, Daily Spin timers and ICON build slots.</w:t>
+      </w:r>
+    </w:p>
+    <w:p>
+      <w:pPr>
+        <w:pStyle w:val="ListParagraph"/>
+        <w:numPr>
+          <w:ilvl w:val="0"/>
+          <w:numId w:val="2"/>
+        </w:numPr>
+        <w:spacing w:after="80" w:line="276"/>
+      </w:pPr>
+      <w:r>
+        <w:rPr>
+          <w:rFonts w:ascii="Calibri" w:cs="Calibri" w:eastAsia="Calibri" w:hAnsi="Calibri"/>
+          <w:b/>
+          <w:bCs/>
+          <w:color w:val="1F2328"/>
+        </w:rPr>
+        <w:t xml:space="preserve">Locker codes are retired.</w:t>
+      </w:r>
+      <w:r>
+        <w:rPr>
+          <w:rFonts w:ascii="Calibri" w:cs="Calibri" w:eastAsia="Calibri" w:hAnsi="Calibri"/>
+          <w:color w:val="1F2328"/>
+        </w:rPr>
+        <w:t xml:space="preserve"> Every code, HELP-I-NEED-VC included, stops working as soon as you update (it says the code has expired).</w:t>
+      </w:r>
+    </w:p>
+    <w:p>
+      <w:pPr>
+        <w:pStyle w:val="ListParagraph"/>
+        <w:numPr>
+          <w:ilvl w:val="0"/>
+          <w:numId w:val="2"/>
+        </w:numPr>
+        <w:spacing w:after="80" w:line="276"/>
+      </w:pPr>
+      <w:r>
+        <w:rPr>
+          <w:rFonts w:ascii="Calibri" w:cs="Calibri" w:eastAsia="Calibri" w:hAnsi="Calibri"/>
+          <w:b/>
+          <w:bCs/>
+          <w:color w:val="1F2328"/>
+        </w:rPr>
+        <w:t xml:space="preserve">A new AI world:</w:t>
+      </w:r>
+      <w:r>
+        <w:rPr>
+          <w:rFonts w:ascii="Calibri" w:cs="Calibri" w:eastAsia="Calibri" w:hAnsi="Calibri"/>
+          <w:color w:val="1F2328"/>
+        </w:rPr>
+        <w:t xml:space="preserve"> every account gets a brand-new world of AI hoopers, all starting from scratch. AI ICONs, and with them the ICON Squad, come back as the world grows, in about six to eight weeks.</w:t>
+      </w:r>
+    </w:p>
+    <w:p>
+      <w:pPr>
+        <w:pStyle w:val="ListParagraph"/>
+        <w:numPr>
+          <w:ilvl w:val="0"/>
+          <w:numId w:val="2"/>
+        </w:numPr>
+        <w:spacing w:after="80" w:line="276"/>
+      </w:pPr>
+      <w:r>
+        <w:rPr>
+          <w:rFonts w:ascii="Calibri" w:cs="Calibri" w:eastAsia="Calibri" w:hAnsi="Calibri"/>
+          <w:b/>
+          <w:bCs/>
+          <w:color w:val="1F2328"/>
+        </w:rPr>
+        <w:t xml:space="preserve">Kept:</w:t>
+      </w:r>
+    </w:p>
+    <w:p>
+      <w:pPr>
+        <w:pStyle w:val="ListParagraph"/>
+        <w:numPr>
+          <w:ilvl w:val="1"/>
+          <w:numId w:val="2"/>
+        </w:numPr>
+        <w:spacing w:after="80" w:line="276"/>
+      </w:pPr>
+      <w:r>
+        <w:rPr>
+          <w:rFonts w:ascii="Calibri" w:cs="Calibri" w:eastAsia="Calibri" w:hAnsi="Calibri"/>
+          <w:color w:val="1F2328"/>
+        </w:rPr>
+        <w:t xml:space="preserve">your account (username and password), so you sign in as before, and you stay signed in;</w:t>
+      </w:r>
+    </w:p>
+    <w:p>
+      <w:pPr>
+        <w:pStyle w:val="ListParagraph"/>
+        <w:numPr>
+          <w:ilvl w:val="1"/>
+          <w:numId w:val="2"/>
+        </w:numPr>
+        <w:spacing w:after="80" w:line="276"/>
+      </w:pPr>
+      <w:r>
+        <w:rPr>
+          <w:rFonts w:ascii="Calibri" w:cs="Calibri" w:eastAsia="Calibri" w:hAnsi="Calibri"/>
+          <w:color w:val="1F2328"/>
+        </w:rPr>
+        <w:t xml:space="preserve">your friends list of real players;</w:t>
+      </w:r>
+    </w:p>
+    <w:p>
+      <w:pPr>
+        <w:pStyle w:val="ListParagraph"/>
+        <w:numPr>
+          <w:ilvl w:val="1"/>
+          <w:numId w:val="2"/>
+        </w:numPr>
+        <w:spacing w:after="80" w:line="276"/>
+      </w:pPr>
+      <w:r>
+        <w:rPr>
+          <w:rFonts w:ascii="Calibri" w:cs="Calibri" w:eastAsia="Calibri" w:hAnsi="Calibri"/>
+          <w:color w:val="1F2328"/>
+        </w:rPr>
+        <w:t xml:space="preserve">your link to the online server.</w:t>
+      </w:r>
+    </w:p>
+    <w:p>
+      <w:pPr>
+        <w:pStyle w:val="ListParagraph"/>
+        <w:numPr>
+          <w:ilvl w:val="0"/>
+          <w:numId w:val="2"/>
+        </w:numPr>
+        <w:spacing w:after="80" w:line="276"/>
+      </w:pPr>
+      <w:r>
+        <w:rPr>
+          <w:rFonts w:ascii="Calibri" w:cs="Calibri" w:eastAsia="Calibri" w:hAnsi="Calibri"/>
+          <w:b/>
+          <w:bCs/>
+          <w:color w:val="1F2328"/>
+        </w:rPr>
+        <w:t xml:space="preserve">You start with 250,000 VC</w:t>
+      </w:r>
+      <w:r>
+        <w:rPr>
+          <w:rFonts w:ascii="Calibri" w:cs="Calibri" w:eastAsia="Calibri" w:hAnsi="Calibri"/>
+          <w:color w:val="1F2328"/>
+        </w:rPr>
+        <w:t xml:space="preserve"> and the free basics every new account gets. New accounts made from now on start with 250,000 VC too (it was 1,000,000).</w:t>
+      </w:r>
+    </w:p>
+    <w:p>
+      <w:pPr>
+        <w:pStyle w:val="ListParagraph"/>
+        <w:numPr>
+          <w:ilvl w:val="0"/>
+          <w:numId w:val="2"/>
+        </w:numPr>
+        <w:spacing w:after="80" w:line="276"/>
+      </w:pPr>
+      <w:r>
+        <w:rPr>
+          <w:rFonts w:ascii="Calibri" w:cs="Calibri" w:eastAsia="Calibri" w:hAnsi="Calibri"/>
+          <w:b/>
+          <w:bCs/>
+          <w:color w:val="1F2328"/>
+        </w:rPr>
+        <w:t xml:space="preserve">When it happens:</w:t>
+      </w:r>
+    </w:p>
+    <w:p>
+      <w:pPr>
+        <w:pStyle w:val="ListParagraph"/>
+        <w:numPr>
+          <w:ilvl w:val="1"/>
+          <w:numId w:val="2"/>
+        </w:numPr>
+        <w:spacing w:after="80" w:line="276"/>
+      </w:pPr>
+      <w:r>
+        <w:rPr>
+          <w:rFonts w:ascii="Calibri" w:cs="Calibri" w:eastAsia="Calibri" w:hAnsi="Calibri"/>
+          <w:color w:val="1F2328"/>
+        </w:rPr>
+        <w:t xml:space="preserve">If the game is open, it warns you 10 minutes and 1 minute ahead, then reloads onto your fresh account.</w:t>
+      </w:r>
+    </w:p>
+    <w:p>
+      <w:pPr>
+        <w:pStyle w:val="ListParagraph"/>
+        <w:numPr>
+          <w:ilvl w:val="1"/>
+          <w:numId w:val="2"/>
+        </w:numPr>
+        <w:spacing w:after="80" w:line="276"/>
+      </w:pPr>
+      <w:r>
+        <w:rPr>
+          <w:rFonts w:ascii="Calibri" w:cs="Calibri" w:eastAsia="Calibri" w:hAnsi="Calibri"/>
+          <w:color w:val="1F2328"/>
+        </w:rPr>
+        <w:t xml:space="preserve">Otherwise your copy resets the first time it runs after midnight. A copy updated later resets the first time it starts.</w:t>
+      </w:r>
+    </w:p>
+    <w:p>
+      <w:pPr>
+        <w:pStyle w:val="ListParagraph"/>
+        <w:numPr>
+          <w:ilvl w:val="1"/>
+          <w:numId w:val="2"/>
+        </w:numPr>
+        <w:spacing w:after="80" w:line="276"/>
+      </w:pPr>
+      <w:r>
+        <w:rPr>
+          <w:rFonts w:ascii="Calibri" w:cs="Calibri" w:eastAsia="Calibri" w:hAnsi="Calibri"/>
+          <w:color w:val="1F2328"/>
+        </w:rPr>
+        <w:t xml:space="preserve">The online server resets at the same moment.</w:t>
+      </w:r>
+    </w:p>
+    <w:p>
+      <w:pPr>
+        <w:pStyle w:val="ListParagraph"/>
+        <w:numPr>
+          <w:ilvl w:val="0"/>
+          <w:numId w:val="2"/>
+        </w:numPr>
+        <w:spacing w:after="80" w:line="276"/>
+      </w:pPr>
+      <w:r>
+        <w:rPr>
+          <w:rFonts w:ascii="Calibri" w:cs="Calibri" w:eastAsia="Calibri" w:hAnsi="Calibri"/>
+          <w:b/>
+          <w:bCs/>
+          <w:color w:val="1F2328"/>
+        </w:rPr>
+        <w:t xml:space="preserve">Update before midnight Eastern.</w:t>
+      </w:r>
+      <w:r>
+        <w:rPr>
+          <w:rFonts w:ascii="Calibri" w:cs="Calibri" w:eastAsia="Calibri" w:hAnsi="Calibri"/>
+          <w:color w:val="1F2328"/>
+        </w:rPr>
+        <w:t xml:space="preserve"> You need this update to reset with everyone and to keep playing online.</w:t>
+      </w:r>
+    </w:p>
+    <w:p>
+      <w:pPr>
+        <w:pStyle w:val="ListParagraph"/>
+        <w:numPr>
+          <w:ilvl w:val="0"/>
+          <w:numId w:val="2"/>
+        </w:numPr>
+        <w:spacing w:after="80" w:line="276"/>
+      </w:pPr>
+      <w:r>
+        <w:rPr>
+          <w:rFonts w:ascii="Calibri" w:cs="Calibri" w:eastAsia="Calibri" w:hAnsi="Calibri"/>
+          <w:b/>
+          <w:bCs/>
+          <w:color w:val="1F2328"/>
+        </w:rPr>
+        <w:t xml:space="preserve">A copy of your old save</w:t>
+      </w:r>
+      <w:r>
+        <w:rPr>
+          <w:rFonts w:ascii="Calibri" w:cs="Calibri" w:eastAsia="Calibri" w:hAnsi="Calibri"/>
+          <w:color w:val="1F2328"/>
+        </w:rPr>
+        <w:t xml:space="preserve"> is kept in the game folder, in data\backups.</w:t>
+      </w:r>
+    </w:p>
+    <w:p>
+      <w:pPr>
+        <w:pStyle w:val="Heading2"/>
+        <w:spacing w:after="80" w:before="200"/>
+      </w:pPr>
+      <w:r>
+        <w:rPr>
+          <w:rFonts w:ascii="Calibri" w:cs="Calibri" w:eastAsia="Calibri" w:hAnsi="Calibri"/>
+          <w:b/>
+          <w:bCs/>
+          <w:color w:val="1F2328"/>
+          <w:sz w:val="26"/>
+          <w:szCs w:val="26"/>
+        </w:rPr>
+        <w:t xml:space="preserve">The ICON Squad</w:t>
       </w:r>
     </w:p>
     <w:p>
@@ -1721,7 +2141,7 @@
           <w:sz w:val="19"/>
           <w:szCs w:val="19"/>
         </w:rPr>
-        <w:t xml:space="preserve">(Tests: 181 Python and 487 node tests. A browser check covered a year-old world with the clock moved into a squad's hour at the Old Brick Yard: the real pick, the toast, the Park screen tag, the squad holding a court in one outfit and the phone list, with no page errors. The one-squad rule was checked over 3,200 random park steps with half the AI as ICONs: no other team ever had more than two.)</w:t>
+        <w:t xml:space="preserve">(Tests: 186 Python and 490 node tests. The reset was checked on a real save through the game's own service, with the time moved up: builds, VC and items wiped, 250,000 VC, still signed in, a new AI world and the backup written. A browser check covered a year-old world with the clock moved into a squad's hour at the Old Brick Yard: the real pick, the toast, the Park screen tag, the squad holding a court in one outfit and the phone list, with no page errors. The one-squad rule was checked over 3,200 random park steps with half the AI as ICONs: no other team ever had more than two.)</w:t>
       </w:r>
     </w:p>
     <w:sectPr>

</xml_diff>

<commit_message>
quick fix for AI friends
</commit_message>
<xml_diff>
--- a/PATCH_NOTES_v0.4.8.6.docx
+++ b/PATCH_NOTES_v0.4.8.6.docx
@@ -1434,6 +1434,95 @@
           <w:color w:val="1F2328"/>
         </w:rPr>
         <w:t xml:space="preserve"> is kept in the game folder, in data\backups.</w:t>
+      </w:r>
+    </w:p>
+    <w:p>
+      <w:pPr>
+        <w:pStyle w:val="ListParagraph"/>
+        <w:numPr>
+          <w:ilvl w:val="0"/>
+          <w:numId w:val="2"/>
+        </w:numPr>
+        <w:spacing w:after="80" w:line="276"/>
+      </w:pPr>
+      <w:r>
+        <w:rPr>
+          <w:rFonts w:ascii="Calibri" w:cs="Calibri" w:eastAsia="Calibri" w:hAnsi="Calibri"/>
+          <w:b/>
+          <w:bCs/>
+          <w:color w:val="1F2328"/>
+        </w:rPr>
+        <w:t xml:space="preserve">Fixed (Oct 19): AI friends now reset too.</w:t>
+      </w:r>
+      <w:r>
+        <w:rPr>
+          <w:rFonts w:ascii="Calibri" w:cs="Calibri" w:eastAsia="Calibri" w:hAnsi="Calibri"/>
+          <w:color w:val="1F2328"/>
+        </w:rPr>
+        <w:t xml:space="preserve"> A game left open over midnight saved its old AI world (your AI friends and squad, and every AI hooper's progress) back after the reset, before it reloaded. A game in the middle of a match didn't reload at all. Now:</w:t>
+      </w:r>
+    </w:p>
+    <w:p>
+      <w:pPr>
+        <w:pStyle w:val="ListParagraph"/>
+        <w:numPr>
+          <w:ilvl w:val="1"/>
+          <w:numId w:val="2"/>
+        </w:numPr>
+        <w:spacing w:after="80" w:line="276"/>
+      </w:pPr>
+      <w:r>
+        <w:rPr>
+          <w:rFonts w:ascii="Calibri" w:cs="Calibri" w:eastAsia="Calibri" w:hAnsi="Calibri"/>
+          <w:color w:val="1F2328"/>
+        </w:rPr>
+        <w:t xml:space="preserve">the old world can't be saved back;</w:t>
+      </w:r>
+    </w:p>
+    <w:p>
+      <w:pPr>
+        <w:pStyle w:val="ListParagraph"/>
+        <w:numPr>
+          <w:ilvl w:val="1"/>
+          <w:numId w:val="2"/>
+        </w:numPr>
+        <w:spacing w:after="80" w:line="276"/>
+      </w:pPr>
+      <w:r>
+        <w:rPr>
+          <w:rFonts w:ascii="Calibri" w:cs="Calibri" w:eastAsia="Calibri" w:hAnsi="Calibri"/>
+          <w:color w:val="1F2328"/>
+        </w:rPr>
+        <w:t xml:space="preserve">any that got back in is cleared the next time the game starts;</w:t>
+      </w:r>
+    </w:p>
+    <w:p>
+      <w:pPr>
+        <w:pStyle w:val="ListParagraph"/>
+        <w:numPr>
+          <w:ilvl w:val="1"/>
+          <w:numId w:val="2"/>
+        </w:numPr>
+        <w:spacing w:after="80" w:line="276"/>
+      </w:pPr>
+      <w:r>
+        <w:rPr>
+          <w:rFonts w:ascii="Calibri" w:cs="Calibri" w:eastAsia="Calibri" w:hAnsi="Calibri"/>
+          <w:color w:val="1F2328"/>
+        </w:rPr>
+        <w:t xml:space="preserve">an open game stops saving and reloads even mid-match.</w:t>
+      </w:r>
+    </w:p>
+    <w:p>
+      <w:pPr>
+        <w:spacing w:after="140" w:line="288"/>
+      </w:pPr>
+      <w:r>
+        <w:rPr>
+          <w:rFonts w:ascii="Calibri" w:cs="Calibri" w:eastAsia="Calibri" w:hAnsi="Calibri"/>
+          <w:color w:val="1F2328"/>
+        </w:rPr>
+        <w:t xml:space="preserve">Update and restart, and your AI world starts fresh like everything else.</w:t>
       </w:r>
     </w:p>
     <w:p>

</xml_diff>

<commit_message>
port test + ID fix
</commit_message>
<xml_diff>
--- a/PATCH_NOTES_v0.4.8.6.docx
+++ b/PATCH_NOTES_v0.4.8.6.docx
@@ -30,7 +30,7 @@
           <w:rFonts w:ascii="Calibri" w:cs="Calibri" w:eastAsia="Calibri" w:hAnsi="Calibri"/>
           <w:color w:val="1F2328"/>
         </w:rPr>
-        <w:t xml:space="preserve">v0.4.8.6 is the identity patch: Afterhours 16 is now </w:t>
+        <w:t xml:space="preserve">v0.4.8.6 is the identity patch: the game is now </w:t>
       </w:r>
       <w:r>
         <w:rPr>
@@ -180,7 +180,7 @@
           <w:bCs/>
           <w:color w:val="1F2328"/>
         </w:rPr>
-        <w:t xml:space="preserve">Launched from Afterhours16.exe,</w:t>
+        <w:t xml:space="preserve">Launched from RIMRIFT.exe,</w:t>
       </w:r>
       <w:r>
         <w:rPr>
@@ -756,7 +756,7 @@
           <w:rFonts w:ascii="Calibri" w:cs="Calibri" w:eastAsia="Calibri" w:hAnsi="Calibri"/>
           <w:color w:val="1F2328"/>
         </w:rPr>
-        <w:t xml:space="preserve">The Afterhours jerseys, pullover and tees now carry the RIMRIFT name and lettering. A/H becomes R/R and AH16 becomes RR.</w:t>
+        <w:t xml:space="preserve">The branded jerseys, pullover and tees now carry the RIMRIFT name and the RR lettering.</w:t>
       </w:r>
     </w:p>
     <w:p>
@@ -790,7 +790,7 @@
           <w:rFonts w:ascii="Calibri" w:cs="Calibri" w:eastAsia="Calibri" w:hAnsi="Calibri"/>
           <w:color w:val="1F2328"/>
         </w:rPr>
-        <w:t xml:space="preserve">The AH on every shoe heel is now RR.</w:t>
+        <w:t xml:space="preserve">Every shoe heel says RR.</w:t>
       </w:r>
     </w:p>
     <w:p>
@@ -833,103 +833,52 @@
           <w:sz w:val="32"/>
           <w:szCs w:val="32"/>
         </w:rPr>
-        <w:t xml:space="preserve">What stays the same for now</w:t>
-      </w:r>
-    </w:p>
-    <w:p>
-      <w:pPr>
-        <w:pStyle w:val="ListParagraph"/>
-        <w:numPr>
-          <w:ilvl w:val="0"/>
-          <w:numId w:val="2"/>
-        </w:numPr>
-        <w:spacing w:after="80" w:line="276"/>
-      </w:pPr>
-      <w:r>
-        <w:rPr>
-          <w:rFonts w:ascii="Calibri" w:cs="Calibri" w:eastAsia="Calibri" w:hAnsi="Calibri"/>
-          <w:b/>
-          <w:bCs/>
-          <w:color w:val="1F2328"/>
-        </w:rPr>
-        <w:t xml:space="preserve">Folder, launcher and files:</w:t>
-      </w:r>
-    </w:p>
-    <w:p>
-      <w:pPr>
-        <w:pStyle w:val="ListParagraph"/>
-        <w:numPr>
-          <w:ilvl w:val="1"/>
-          <w:numId w:val="2"/>
-        </w:numPr>
-        <w:spacing w:after="80" w:line="276"/>
-      </w:pPr>
-      <w:r>
-        <w:rPr>
-          <w:rFonts w:ascii="Calibri" w:cs="Calibri" w:eastAsia="Calibri" w:hAnsi="Calibri"/>
-          <w:color w:val="1F2328"/>
-        </w:rPr>
-        <w:t xml:space="preserve">The game folder (C:\Afterhours16), Afterhours16.exe and its icon, and start/host/join.cmd keep their names. They change when RIMRIFT moves to its new engine (Stage 1 of the v0.5 roadmap).</w:t>
-      </w:r>
-    </w:p>
-    <w:p>
-      <w:pPr>
-        <w:pStyle w:val="ListParagraph"/>
-        <w:numPr>
-          <w:ilvl w:val="1"/>
-          <w:numId w:val="2"/>
-        </w:numPr>
-        <w:spacing w:after="80" w:line="276"/>
-      </w:pPr>
-      <w:r>
-        <w:rPr>
-          <w:rFonts w:ascii="Calibri" w:cs="Calibri" w:eastAsia="Calibri" w:hAnsi="Calibri"/>
-          <w:color w:val="1F2328"/>
-        </w:rPr>
-        <w:t xml:space="preserve">The launcher's own setup messages still say Afterhours 16.</w:t>
-      </w:r>
-    </w:p>
-    <w:p>
-      <w:pPr>
-        <w:pStyle w:val="ListParagraph"/>
-        <w:numPr>
-          <w:ilvl w:val="1"/>
-          <w:numId w:val="2"/>
-        </w:numPr>
-        <w:spacing w:after="80" w:line="276"/>
-      </w:pPr>
-      <w:r>
-        <w:rPr>
-          <w:rFonts w:ascii="Calibri" w:cs="Calibri" w:eastAsia="Calibri" w:hAnsi="Calibri"/>
-          <w:color w:val="1F2328"/>
-        </w:rPr>
-        <w:t xml:space="preserve">Your saves are untouched.</w:t>
-      </w:r>
-    </w:p>
-    <w:p>
-      <w:pPr>
-        <w:pStyle w:val="ListParagraph"/>
-        <w:numPr>
-          <w:ilvl w:val="0"/>
-          <w:numId w:val="2"/>
-        </w:numPr>
-        <w:spacing w:after="80" w:line="276"/>
-      </w:pPr>
-      <w:r>
-        <w:rPr>
-          <w:rFonts w:ascii="Calibri" w:cs="Calibri" w:eastAsia="Calibri" w:hAnsi="Calibri"/>
-          <w:b/>
-          <w:bCs/>
-          <w:color w:val="1F2328"/>
-        </w:rPr>
-        <w:t xml:space="preserve">Bug reports</w:t>
-      </w:r>
-      <w:r>
-        <w:rPr>
-          <w:rFonts w:ascii="Calibri" w:cs="Calibri" w:eastAsia="Calibri" w:hAnsi="Calibri"/>
-          <w:color w:val="1F2328"/>
-        </w:rPr>
-        <w:t xml:space="preserve"> still go to Afterhours16_Bug_Reports.txt in the game folder.</w:t>
+        <w:t xml:space="preserve">What stays the same</w:t>
+      </w:r>
+    </w:p>
+    <w:p>
+      <w:pPr>
+        <w:pStyle w:val="ListParagraph"/>
+        <w:numPr>
+          <w:ilvl w:val="0"/>
+          <w:numId w:val="2"/>
+        </w:numPr>
+        <w:spacing w:after="80" w:line="276"/>
+      </w:pPr>
+      <w:r>
+        <w:rPr>
+          <w:rFonts w:ascii="Calibri" w:cs="Calibri" w:eastAsia="Calibri" w:hAnsi="Calibri"/>
+          <w:b/>
+          <w:bCs/>
+          <w:color w:val="1F2328"/>
+        </w:rPr>
+        <w:t xml:space="preserve">Your saves</w:t>
+      </w:r>
+      <w:r>
+        <w:rPr>
+          <w:rFonts w:ascii="Calibri" w:cs="Calibri" w:eastAsia="Calibri" w:hAnsi="Calibri"/>
+          <w:color w:val="1F2328"/>
+        </w:rPr>
+        <w:t xml:space="preserve"> are untouched.</w:t>
+      </w:r>
+    </w:p>
+    <w:p>
+      <w:pPr>
+        <w:pStyle w:val="ListParagraph"/>
+        <w:numPr>
+          <w:ilvl w:val="0"/>
+          <w:numId w:val="2"/>
+        </w:numPr>
+        <w:spacing w:after="80" w:line="276"/>
+      </w:pPr>
+      <w:r>
+        <w:rPr>
+          <w:rFonts w:ascii="Calibri" w:cs="Calibri" w:eastAsia="Calibri" w:hAnsi="Calibri"/>
+          <w:i/>
+          <w:iCs/>
+          <w:color w:val="1F2328"/>
+        </w:rPr>
+        <w:t xml:space="preserve">(The launcher, its icon and the game's files took the RIMRIFT name in quick patch 3, below.)</w:t>
       </w:r>
     </w:p>
     <w:p>
@@ -2440,7 +2389,7 @@
           <w:bCs/>
           <w:color w:val="1F2328"/>
         </w:rPr>
-        <w:t xml:space="preserve">From Afterhours16.exe</w:t>
+        <w:t xml:space="preserve">From RIMRIFT.exe</w:t>
       </w:r>
       <w:r>
         <w:rPr>
@@ -2448,6 +2397,233 @@
           <w:color w:val="1F2328"/>
         </w:rPr>
         <w:t xml:space="preserve"> the sound starts right away. In an ordinary browser tab, the browser may hold all sound until your first click or key.</w:t>
+      </w:r>
+    </w:p>
+    <w:p>
+      <w:pPr>
+        <w:pBdr>
+          <w:bottom w:val="single" w:color="D0D7DE" w:sz="4" w:space="1"/>
+        </w:pBdr>
+        <w:spacing w:after="160" w:before="80"/>
+      </w:pPr>
+    </w:p>
+    <w:p>
+      <w:pPr>
+        <w:pStyle w:val="Heading1"/>
+        <w:spacing w:after="120" w:before="280"/>
+      </w:pPr>
+      <w:r>
+        <w:rPr>
+          <w:rFonts w:ascii="Calibri" w:cs="Calibri" w:eastAsia="Calibri" w:hAnsi="Calibri"/>
+          <w:b/>
+          <w:bCs/>
+          <w:color w:val="C8102E"/>
+          <w:sz w:val="32"/>
+          <w:szCs w:val="32"/>
+        </w:rPr>
+        <w:t xml:space="preserve">Quick patch 3 (Oct 19): RIMRIFT everywhere</w:t>
+      </w:r>
+    </w:p>
+    <w:p>
+      <w:pPr>
+        <w:spacing w:after="140" w:line="288"/>
+      </w:pPr>
+      <w:r>
+        <w:rPr>
+          <w:rFonts w:ascii="Calibri" w:cs="Calibri" w:eastAsia="Calibri" w:hAnsi="Calibri"/>
+          <w:color w:val="1F2328"/>
+        </w:rPr>
+        <w:t xml:space="preserve">The last of the old name is gone. Everything you see, and every file the game makes, now says RIMRIFT.</w:t>
+      </w:r>
+    </w:p>
+    <w:p>
+      <w:pPr>
+        <w:pStyle w:val="ListParagraph"/>
+        <w:numPr>
+          <w:ilvl w:val="0"/>
+          <w:numId w:val="2"/>
+        </w:numPr>
+        <w:spacing w:after="80" w:line="276"/>
+      </w:pPr>
+      <w:r>
+        <w:rPr>
+          <w:rFonts w:ascii="Calibri" w:cs="Calibri" w:eastAsia="Calibri" w:hAnsi="Calibri"/>
+          <w:b/>
+          <w:bCs/>
+          <w:color w:val="1F2328"/>
+        </w:rPr>
+        <w:t xml:space="preserve">RIMRIFT.exe starts the game.</w:t>
+      </w:r>
+      <w:r>
+        <w:rPr>
+          <w:rFonts w:ascii="Calibri" w:cs="Calibri" w:eastAsia="Calibri" w:hAnsi="Calibri"/>
+          <w:color w:val="1F2328"/>
+        </w:rPr>
+        <w:t xml:space="preserve"> It has the RIMRIFT icon: the mark on a Carbon tile, sharp from the taskbar to the desktop. Its window, its one-time Python setup and its file properties all say RIMRIFT (by Silverback Studios).</w:t>
+      </w:r>
+    </w:p>
+    <w:p>
+      <w:pPr>
+        <w:pStyle w:val="ListParagraph"/>
+        <w:numPr>
+          <w:ilvl w:val="1"/>
+          <w:numId w:val="2"/>
+        </w:numPr>
+        <w:spacing w:after="80" w:line="276"/>
+      </w:pPr>
+      <w:r>
+        <w:rPr>
+          <w:rFonts w:ascii="Calibri" w:cs="Calibri" w:eastAsia="Calibri" w:hAnsi="Calibri"/>
+          <w:color w:val="1F2328"/>
+        </w:rPr>
+        <w:t xml:space="preserve">Delete the old launcher .exe, the one with the old name.</w:t>
+      </w:r>
+    </w:p>
+    <w:p>
+      <w:pPr>
+        <w:pStyle w:val="ListParagraph"/>
+        <w:numPr>
+          <w:ilvl w:val="1"/>
+          <w:numId w:val="2"/>
+        </w:numPr>
+        <w:spacing w:after="80" w:line="276"/>
+      </w:pPr>
+      <w:r>
+        <w:rPr>
+          <w:rFonts w:ascii="Calibri" w:cs="Calibri" w:eastAsia="Calibri" w:hAnsi="Calibri"/>
+          <w:color w:val="1F2328"/>
+        </w:rPr>
+        <w:t xml:space="preserve">Remake any desktop or taskbar shortcut so it points at RIMRIFT.exe.</w:t>
+      </w:r>
+    </w:p>
+    <w:p>
+      <w:pPr>
+        <w:pStyle w:val="ListParagraph"/>
+        <w:numPr>
+          <w:ilvl w:val="0"/>
+          <w:numId w:val="2"/>
+        </w:numPr>
+        <w:spacing w:after="80" w:line="276"/>
+      </w:pPr>
+      <w:r>
+        <w:rPr>
+          <w:rFonts w:ascii="Calibri" w:cs="Calibri" w:eastAsia="Calibri" w:hAnsi="Calibri"/>
+          <w:b/>
+          <w:bCs/>
+          <w:color w:val="1F2328"/>
+        </w:rPr>
+        <w:t xml:space="preserve">Your save moves over by itself.</w:t>
+      </w:r>
+      <w:r>
+        <w:rPr>
+          <w:rFonts w:ascii="Calibri" w:cs="Calibri" w:eastAsia="Calibri" w:hAnsi="Calibri"/>
+          <w:color w:val="1F2328"/>
+        </w:rPr>
+        <w:t xml:space="preserve"> The first time RIMRIFT starts, the save becomes data\rimrift.sqlite3, with nothing lost. Your settings carry over too.</w:t>
+      </w:r>
+    </w:p>
+    <w:p>
+      <w:pPr>
+        <w:pStyle w:val="ListParagraph"/>
+        <w:numPr>
+          <w:ilvl w:val="0"/>
+          <w:numId w:val="2"/>
+        </w:numPr>
+        <w:spacing w:after="80" w:line="276"/>
+      </w:pPr>
+      <w:r>
+        <w:rPr>
+          <w:rFonts w:ascii="Calibri" w:cs="Calibri" w:eastAsia="Calibri" w:hAnsi="Calibri"/>
+          <w:b/>
+          <w:bCs/>
+          <w:color w:val="1F2328"/>
+        </w:rPr>
+        <w:t xml:space="preserve">Bug reports</w:t>
+      </w:r>
+      <w:r>
+        <w:rPr>
+          <w:rFonts w:ascii="Calibri" w:cs="Calibri" w:eastAsia="Calibri" w:hAnsi="Calibri"/>
+          <w:color w:val="1F2328"/>
+        </w:rPr>
+        <w:t xml:space="preserve"> go to RIMRIFT_Bug_Reports.txt in the game folder. The old reports file can be deleted.</w:t>
+      </w:r>
+    </w:p>
+    <w:p>
+      <w:pPr>
+        <w:pStyle w:val="ListParagraph"/>
+        <w:numPr>
+          <w:ilvl w:val="0"/>
+          <w:numId w:val="2"/>
+        </w:numPr>
+        <w:spacing w:after="80" w:line="276"/>
+      </w:pPr>
+      <w:r>
+        <w:rPr>
+          <w:rFonts w:ascii="Calibri" w:cs="Calibri" w:eastAsia="Calibri" w:hAnsi="Calibri"/>
+          <w:b/>
+          <w:bCs/>
+          <w:color w:val="1F2328"/>
+        </w:rPr>
+        <w:t xml:space="preserve">host.cmd, join.cmd and start.cmd:</w:t>
+      </w:r>
+      <w:r>
+        <w:rPr>
+          <w:rFonts w:ascii="Calibri" w:cs="Calibri" w:eastAsia="Calibri" w:hAnsi="Calibri"/>
+          <w:color w:val="1F2328"/>
+        </w:rPr>
+        <w:t xml:space="preserve"> their windows and messages say RIMRIFT. Hosting still remembers your join code, and nobody has to sign in again.</w:t>
+      </w:r>
+    </w:p>
+    <w:p>
+      <w:pPr>
+        <w:pStyle w:val="ListParagraph"/>
+        <w:numPr>
+          <w:ilvl w:val="0"/>
+          <w:numId w:val="2"/>
+        </w:numPr>
+        <w:spacing w:after="80" w:line="276"/>
+      </w:pPr>
+      <w:r>
+        <w:rPr>
+          <w:rFonts w:ascii="Calibri" w:cs="Calibri" w:eastAsia="Calibri" w:hAnsi="Calibri"/>
+          <w:b/>
+          <w:bCs/>
+          <w:color w:val="1F2328"/>
+        </w:rPr>
+        <w:t xml:space="preserve">The arena</w:t>
+      </w:r>
+      <w:r>
+        <w:rPr>
+          <w:rFonts w:ascii="Calibri" w:cs="Calibri" w:eastAsia="Calibri" w:hAnsi="Calibri"/>
+          <w:color w:val="1F2328"/>
+        </w:rPr>
+        <w:t xml:space="preserve"> is the RIMRIFT Arena, and the game service's own window says RIMRIFT.</w:t>
+      </w:r>
+    </w:p>
+    <w:p>
+      <w:pPr>
+        <w:pStyle w:val="ListParagraph"/>
+        <w:numPr>
+          <w:ilvl w:val="0"/>
+          <w:numId w:val="2"/>
+        </w:numPr>
+        <w:spacing w:after="80" w:line="276"/>
+      </w:pPr>
+      <w:r>
+        <w:rPr>
+          <w:rFonts w:ascii="Calibri" w:cs="Calibri" w:eastAsia="Calibri" w:hAnsi="Calibri"/>
+          <w:b/>
+          <w:bCs/>
+          <w:color w:val="1F2328"/>
+        </w:rPr>
+        <w:t xml:space="preserve">The welcome card</w:t>
+      </w:r>
+      <w:r>
+        <w:rPr>
+          <w:rFonts w:ascii="Calibri" w:cs="Calibri" w:eastAsia="Calibri" w:hAnsi="Calibri"/>
+          <w:color w:val="1F2328"/>
+        </w:rPr>
+        <w:t xml:space="preserve"> says new accounts get 250,000 VC, the amount since the season reset.</w:t>
       </w:r>
     </w:p>
     <w:sectPr>

</xml_diff>

<commit_message>
Add ICON cap breaker respec
Let ICON builds reclaim and reassign all placed cap breakers. The first respec is free; subsequent respecs cost 250,000 VC. Adds the API route, two-step confirmation UI, documentation, and coverage for eligibility and payment handling.
</commit_message>
<xml_diff>
--- a/PATCH_NOTES_v0.4.8.6.docx
+++ b/PATCH_NOTES_v0.4.8.6.docx
@@ -4655,6 +4655,170 @@
         <w:t xml:space="preserve"> Hold R2 + right stick down + Square (Xbox: RT + right stick down + X; keyboard: sprint + the step-back key + shoot) while driving at the rim, within about 4 m, and any build dunks it, whatever its dunk rating or height. A build that can't normally dunk uses a basic one- or two-hand dunk. Makes, misses and blocks still come from the dunk's usual chances, so a poor dunker misses more. Further out it's a normal drive. Any two of the three still do what they did before. The combo is listed in the controls.</w:t>
       </w:r>
     </w:p>
+    <w:p>
+      <w:pPr>
+        <w:pStyle w:val="Heading1"/>
+        <w:spacing w:after="120" w:before="280"/>
+      </w:pPr>
+      <w:r>
+        <w:rPr>
+          <w:rFonts w:ascii="Calibri" w:cs="Calibri" w:eastAsia="Calibri" w:hAnsi="Calibri"/>
+          <w:b/>
+          <w:bCs/>
+          <w:color w:val="C8102E"/>
+          <w:sz w:val="32"/>
+          <w:szCs w:val="32"/>
+        </w:rPr>
+        <w:t xml:space="preserve">Quick patch 6 (Oct 20): Cap breaker respec for ICON builds</w:t>
+      </w:r>
+    </w:p>
+    <w:p>
+      <w:pPr>
+        <w:spacing w:after="140" w:line="288"/>
+      </w:pPr>
+      <w:r>
+        <w:rPr>
+          <w:rFonts w:ascii="Calibri" w:cs="Calibri" w:eastAsia="Calibri" w:hAnsi="Calibri"/>
+          <w:b/>
+          <w:bCs/>
+          <w:color w:val="1F2328"/>
+        </w:rPr>
+        <w:t xml:space="preserve">Respec your cap breakers once a build is ICON.</w:t>
+      </w:r>
+      <w:r>
+        <w:rPr>
+          <w:rFonts w:ascii="Calibri" w:cs="Calibri" w:eastAsia="Calibri" w:hAnsi="Calibri"/>
+          <w:color w:val="1F2328"/>
+        </w:rPr>
+        <w:t xml:space="preserve"> A build that has reached 99 OVR ICON status can now take back every cap breaker it placed and place them again wherever you like. Open the build's Cap Breakers tab (next to Upgrades) and press </w:t>
+      </w:r>
+      <w:r>
+        <w:rPr>
+          <w:rFonts w:ascii="Calibri" w:cs="Calibri" w:eastAsia="Calibri" w:hAnsi="Calibri"/>
+          <w:b/>
+          <w:bCs/>
+          <w:color w:val="1F2328"/>
+        </w:rPr>
+        <w:t xml:space="preserve">Respec</w:t>
+      </w:r>
+      <w:r>
+        <w:rPr>
+          <w:rFonts w:ascii="Calibri" w:cs="Calibri" w:eastAsia="Calibri" w:hAnsi="Calibri"/>
+          <w:color w:val="1F2328"/>
+        </w:rPr>
+        <w:t xml:space="preserve"> at the top, then </w:t>
+      </w:r>
+      <w:r>
+        <w:rPr>
+          <w:rFonts w:ascii="Calibri" w:cs="Calibri" w:eastAsia="Calibri" w:hAnsi="Calibri"/>
+          <w:b/>
+          <w:bCs/>
+          <w:color w:val="1F2328"/>
+        </w:rPr>
+        <w:t xml:space="preserve">Confirm respec</w:t>
+      </w:r>
+      <w:r>
+        <w:rPr>
+          <w:rFonts w:ascii="Calibri" w:cs="Calibri" w:eastAsia="Calibri" w:hAnsi="Calibri"/>
+          <w:color w:val="1F2328"/>
+        </w:rPr>
+        <w:t xml:space="preserve">.</w:t>
+      </w:r>
+    </w:p>
+    <w:p>
+      <w:pPr>
+        <w:pStyle w:val="ListParagraph"/>
+        <w:numPr>
+          <w:ilvl w:val="0"/>
+          <w:numId w:val="2"/>
+        </w:numPr>
+        <w:spacing w:after="80" w:line="276"/>
+      </w:pPr>
+      <w:r>
+        <w:rPr>
+          <w:rFonts w:ascii="Calibri" w:cs="Calibri" w:eastAsia="Calibri" w:hAnsi="Calibri"/>
+          <w:b/>
+          <w:bCs/>
+          <w:color w:val="1F2328"/>
+        </w:rPr>
+        <w:t xml:space="preserve">The first respec on each build is free.</w:t>
+      </w:r>
+      <w:r>
+        <w:rPr>
+          <w:rFonts w:ascii="Calibri" w:cs="Calibri" w:eastAsia="Calibri" w:hAnsi="Calibri"/>
+          <w:color w:val="1F2328"/>
+        </w:rPr>
+        <w:t xml:space="preserve"> Every respec after that costs </w:t>
+      </w:r>
+      <w:r>
+        <w:rPr>
+          <w:rFonts w:ascii="Calibri" w:cs="Calibri" w:eastAsia="Calibri" w:hAnsi="Calibri"/>
+          <w:b/>
+          <w:bCs/>
+          <w:color w:val="1F2328"/>
+        </w:rPr>
+        <w:t xml:space="preserve">250,000 VC</w:t>
+      </w:r>
+      <w:r>
+        <w:rPr>
+          <w:rFonts w:ascii="Calibri" w:cs="Calibri" w:eastAsia="Calibri" w:hAnsi="Calibri"/>
+          <w:color w:val="1F2328"/>
+        </w:rPr>
+        <w:t xml:space="preserve">. If you don't have the VC, nothing changes.</w:t>
+      </w:r>
+    </w:p>
+    <w:p>
+      <w:pPr>
+        <w:pStyle w:val="ListParagraph"/>
+        <w:numPr>
+          <w:ilvl w:val="0"/>
+          <w:numId w:val="2"/>
+        </w:numPr>
+        <w:spacing w:after="80" w:line="276"/>
+      </w:pPr>
+      <w:r>
+        <w:rPr>
+          <w:rFonts w:ascii="Calibri" w:cs="Calibri" w:eastAsia="Calibri" w:hAnsi="Calibri"/>
+          <w:b/>
+          <w:bCs/>
+          <w:color w:val="1F2328"/>
+        </w:rPr>
+        <w:t xml:space="preserve">Only ICON builds can respec.</w:t>
+      </w:r>
+      <w:r>
+        <w:rPr>
+          <w:rFonts w:ascii="Calibri" w:cs="Calibri" w:eastAsia="Calibri" w:hAnsi="Calibri"/>
+          <w:color w:val="1F2328"/>
+        </w:rPr>
+        <w:t xml:space="preserve"> The button shows on every build, but stays closed with a note until that build reaches ICON status (99 OVR, every cap breaker placed, every badge maxed). Once a build has been ICON, the option stays open to it for good.</w:t>
+      </w:r>
+    </w:p>
+    <w:p>
+      <w:pPr>
+        <w:pStyle w:val="ListParagraph"/>
+        <w:numPr>
+          <w:ilvl w:val="0"/>
+          <w:numId w:val="2"/>
+        </w:numPr>
+        <w:spacing w:after="80" w:line="276"/>
+      </w:pPr>
+      <w:r>
+        <w:rPr>
+          <w:rFonts w:ascii="Calibri" w:cs="Calibri" w:eastAsia="Calibri" w:hAnsi="Calibri"/>
+          <w:b/>
+          <w:bCs/>
+          <w:color w:val="1F2328"/>
+        </w:rPr>
+        <w:t xml:space="preserve">What it does:</w:t>
+      </w:r>
+      <w:r>
+        <w:rPr>
+          <w:rFonts w:ascii="Calibri" w:cs="Calibri" w:eastAsia="Calibri" w:hAnsi="Calibri"/>
+          <w:color w:val="1F2328"/>
+        </w:rPr>
+        <w:t xml:space="preserve"> every attribute goes back to its cap without the breakers (the upgrades you paid VC for stay), and all the build's cap breakers return to it, ready to place. Until you place them again the build sits below 99 and its ICON status waits for them; its ICON build slot is kept.</w:t>
+      </w:r>
+    </w:p>
     <w:sectPr>
       <w:pgSz w:w="12240" w:h="15840" w:orient="portrait"/>
       <w:pgMar w:top="1440" w:right="1440" w:bottom="1440" w:left="1440" w:header="708" w:footer="708" w:gutter="0"/>

</xml_diff>

<commit_message>
Add Quick Patch 7 gameplay and UI updates
Smooth menu scrolling and interactions, add forced dunk and layup controls, relay park emotes, and make park hosting consistent. Add Oprah's Pass Package, restrict Icon items to their badge holders, and show Icon badge activations to everyone in a game.
</commit_message>
<xml_diff>
--- a/PATCH_NOTES_v0.4.8.6.docx
+++ b/PATCH_NOTES_v0.4.8.6.docx
@@ -4819,6 +4819,1269 @@
         <w:t xml:space="preserve"> every attribute goes back to its cap without the breakers (the upgrades you paid VC for stay), and all the build's cap breakers return to it, ready to place. Until you place them again the build sits below 99 and its ICON status waits for them; its ICON build slot is kept.</w:t>
       </w:r>
     </w:p>
+    <w:p>
+      <w:pPr>
+        <w:pStyle w:val="Heading1"/>
+        <w:spacing w:after="120" w:before="280"/>
+      </w:pPr>
+      <w:r>
+        <w:rPr>
+          <w:rFonts w:ascii="Calibri" w:cs="Calibri" w:eastAsia="Calibri" w:hAnsi="Calibri"/>
+          <w:b/>
+          <w:bCs/>
+          <w:color w:val="C8102E"/>
+          <w:sz w:val="32"/>
+          <w:szCs w:val="32"/>
+        </w:rPr>
+        <w:t xml:space="preserve">Quick patch 7 (Oct 21): Smooth menus, new finishing controls, emotes online, Icon badges on show</w:t>
+      </w:r>
+    </w:p>
+    <w:p>
+      <w:pPr>
+        <w:spacing w:after="140" w:line="288"/>
+      </w:pPr>
+      <w:r>
+        <w:rPr>
+          <w:rFonts w:ascii="Calibri" w:cs="Calibri" w:eastAsia="Calibri" w:hAnsi="Calibri"/>
+          <w:b/>
+          <w:bCs/>
+          <w:color w:val="1F2328"/>
+        </w:rPr>
+        <w:t xml:space="preserve">Menus scroll and click the way they should.</w:t>
+      </w:r>
+    </w:p>
+    <w:p>
+      <w:pPr>
+        <w:pStyle w:val="ListParagraph"/>
+        <w:numPr>
+          <w:ilvl w:val="0"/>
+          <w:numId w:val="2"/>
+        </w:numPr>
+        <w:spacing w:after="80" w:line="276"/>
+      </w:pPr>
+      <w:r>
+        <w:rPr>
+          <w:rFonts w:ascii="Calibri" w:cs="Calibri" w:eastAsia="Calibri" w:hAnsi="Calibri"/>
+          <w:b/>
+          <w:bCs/>
+          <w:color w:val="1F2328"/>
+        </w:rPr>
+        <w:t xml:space="preserve">The mouse wheel no longer lags or gets ignored.</w:t>
+      </w:r>
+      <w:r>
+        <w:rPr>
+          <w:rFonts w:ascii="Calibri" w:cs="Calibri" w:eastAsia="Calibri" w:hAnsi="Calibri"/>
+          <w:color w:val="1F2328"/>
+        </w:rPr>
+        <w:t xml:space="preserve"> Before, menus waited on the 3D showroom before they could scroll, and that's fixed.</w:t>
+      </w:r>
+    </w:p>
+    <w:p>
+      <w:pPr>
+        <w:pStyle w:val="ListParagraph"/>
+        <w:numPr>
+          <w:ilvl w:val="0"/>
+          <w:numId w:val="2"/>
+        </w:numPr>
+        <w:spacing w:after="80" w:line="276"/>
+      </w:pPr>
+      <w:r>
+        <w:rPr>
+          <w:rFonts w:ascii="Calibri" w:cs="Calibri" w:eastAsia="Calibri" w:hAnsi="Calibri"/>
+          <w:b/>
+          <w:bCs/>
+          <w:color w:val="1F2328"/>
+        </w:rPr>
+        <w:t xml:space="preserve">Lists stay where you scrolled them.</w:t>
+      </w:r>
+      <w:r>
+        <w:rPr>
+          <w:rFonts w:ascii="Calibri" w:cs="Calibri" w:eastAsia="Calibri" w:hAnsi="Calibri"/>
+          <w:color w:val="1F2328"/>
+        </w:rPr>
+        <w:t xml:space="preserve"> Buying, equipping, upgrading, timers ticking, or the phone and countdowns refreshing used to jump a list back to the top. Now it stays put. Switching to a new tab or category still starts at the top.</w:t>
+      </w:r>
+    </w:p>
+    <w:p>
+      <w:pPr>
+        <w:pStyle w:val="ListParagraph"/>
+        <w:numPr>
+          <w:ilvl w:val="0"/>
+          <w:numId w:val="2"/>
+        </w:numPr>
+        <w:spacing w:after="80" w:line="276"/>
+      </w:pPr>
+      <w:r>
+        <w:rPr>
+          <w:rFonts w:ascii="Calibri" w:cs="Calibri" w:eastAsia="Calibri" w:hAnsi="Calibri"/>
+          <w:b/>
+          <w:bCs/>
+          <w:color w:val="1F2328"/>
+        </w:rPr>
+        <w:t xml:space="preserve">One click is enough.</w:t>
+      </w:r>
+      <w:r>
+        <w:rPr>
+          <w:rFonts w:ascii="Calibri" w:cs="Calibri" w:eastAsia="Calibri" w:hAnsi="Calibri"/>
+          <w:color w:val="1F2328"/>
+        </w:rPr>
+        <w:t xml:space="preserve"> Countdowns (the Daily Spin, the phone, the events) no longer swap buttons out from under the cursor, so a click never needs a second try.</w:t>
+      </w:r>
+    </w:p>
+    <w:p>
+      <w:pPr>
+        <w:pStyle w:val="ListParagraph"/>
+        <w:numPr>
+          <w:ilvl w:val="0"/>
+          <w:numId w:val="2"/>
+        </w:numPr>
+        <w:spacing w:after="80" w:line="276"/>
+      </w:pPr>
+      <w:r>
+        <w:rPr>
+          <w:rFonts w:ascii="Calibri" w:cs="Calibri" w:eastAsia="Calibri" w:hAnsi="Calibri"/>
+          <w:b/>
+          <w:bCs/>
+          <w:color w:val="1F2328"/>
+        </w:rPr>
+        <w:t xml:space="preserve">No more doubled requests.</w:t>
+      </w:r>
+      <w:r>
+        <w:rPr>
+          <w:rFonts w:ascii="Calibri" w:cs="Calibri" w:eastAsia="Calibri" w:hAnsi="Calibri"/>
+          <w:color w:val="1F2328"/>
+        </w:rPr>
+        <w:t xml:space="preserve"> Buy, Equip, Save, Add and the other slow buttons can't be sent twice.</w:t>
+      </w:r>
+    </w:p>
+    <w:p>
+      <w:pPr>
+        <w:pStyle w:val="ListParagraph"/>
+        <w:numPr>
+          <w:ilvl w:val="0"/>
+          <w:numId w:val="2"/>
+        </w:numPr>
+        <w:spacing w:after="80" w:line="276"/>
+      </w:pPr>
+      <w:r>
+        <w:rPr>
+          <w:rFonts w:ascii="Calibri" w:cs="Calibri" w:eastAsia="Calibri" w:hAnsi="Calibri"/>
+          <w:b/>
+          <w:bCs/>
+          <w:color w:val="1F2328"/>
+        </w:rPr>
+        <w:t xml:space="preserve">Builder sliders drag in one smooth motion.</w:t>
+      </w:r>
+      <w:r>
+        <w:rPr>
+          <w:rFonts w:ascii="Calibri" w:cs="Calibri" w:eastAsia="Calibri" w:hAnsi="Calibri"/>
+          <w:color w:val="1F2328"/>
+        </w:rPr>
+        <w:t xml:space="preserve"> They no longer cut out mid-drag.</w:t>
+      </w:r>
+    </w:p>
+    <w:p>
+      <w:pPr>
+        <w:pStyle w:val="ListParagraph"/>
+        <w:numPr>
+          <w:ilvl w:val="0"/>
+          <w:numId w:val="2"/>
+        </w:numPr>
+        <w:spacing w:after="80" w:line="276"/>
+      </w:pPr>
+      <w:r>
+        <w:rPr>
+          <w:rFonts w:ascii="Calibri" w:cs="Calibri" w:eastAsia="Calibri" w:hAnsi="Calibri"/>
+          <w:b/>
+          <w:bCs/>
+          <w:color w:val="1F2328"/>
+        </w:rPr>
+        <w:t xml:space="preserve">The wheel stays in the box you're scrolling.</w:t>
+      </w:r>
+      <w:r>
+        <w:rPr>
+          <w:rFonts w:ascii="Calibri" w:cs="Calibri" w:eastAsia="Calibri" w:hAnsi="Calibri"/>
+          <w:color w:val="1F2328"/>
+        </w:rPr>
+        <w:t xml:space="preserve"> Reaching the end of a list or dialog no longer scrolls the page behind it, and short windows can scroll the home hub.</w:t>
+      </w:r>
+    </w:p>
+    <w:p>
+      <w:pPr>
+        <w:pStyle w:val="ListParagraph"/>
+        <w:numPr>
+          <w:ilvl w:val="0"/>
+          <w:numId w:val="2"/>
+        </w:numPr>
+        <w:spacing w:after="80" w:line="276"/>
+      </w:pPr>
+      <w:r>
+        <w:rPr>
+          <w:rFonts w:ascii="Calibri" w:cs="Calibri" w:eastAsia="Calibri" w:hAnsi="Calibri"/>
+          <w:b/>
+          <w:bCs/>
+          <w:color w:val="1F2328"/>
+        </w:rPr>
+        <w:t xml:space="preserve">Keyboard keys work in menus again.</w:t>
+      </w:r>
+      <w:r>
+        <w:rPr>
+          <w:rFonts w:ascii="Calibri" w:cs="Calibri" w:eastAsia="Calibri" w:hAnsi="Calibri"/>
+          <w:color w:val="1F2328"/>
+        </w:rPr>
+        <w:t xml:space="preserve"> The arrows, Space and Tab scroll lists, press the focused button and move between fields.</w:t>
+      </w:r>
+    </w:p>
+    <w:p>
+      <w:pPr>
+        <w:pStyle w:val="ListParagraph"/>
+        <w:numPr>
+          <w:ilvl w:val="0"/>
+          <w:numId w:val="2"/>
+        </w:numPr>
+        <w:spacing w:after="80" w:line="276"/>
+      </w:pPr>
+      <w:r>
+        <w:rPr>
+          <w:rFonts w:ascii="Calibri" w:cs="Calibri" w:eastAsia="Calibri" w:hAnsi="Calibri"/>
+          <w:b/>
+          <w:bCs/>
+          <w:color w:val="1F2328"/>
+        </w:rPr>
+        <w:t xml:space="preserve">Controller:</w:t>
+      </w:r>
+      <w:r>
+        <w:rPr>
+          <w:rFonts w:ascii="Calibri" w:cs="Calibri" w:eastAsia="Calibri" w:hAnsi="Calibri"/>
+          <w:color w:val="1F2328"/>
+        </w:rPr>
+        <w:t xml:space="preserve"> turning the mouse wheel hides the controller's focus ring, and a menu that redraws no longer pulls the page back to it.</w:t>
+      </w:r>
+    </w:p>
+    <w:p>
+      <w:pPr>
+        <w:pStyle w:val="ListParagraph"/>
+        <w:numPr>
+          <w:ilvl w:val="0"/>
+          <w:numId w:val="2"/>
+        </w:numPr>
+        <w:spacing w:after="80" w:line="276"/>
+      </w:pPr>
+      <w:r>
+        <w:rPr>
+          <w:rFonts w:ascii="Calibri" w:cs="Calibri" w:eastAsia="Calibri" w:hAnsi="Calibri"/>
+          <w:b/>
+          <w:bCs/>
+          <w:color w:val="1F2328"/>
+        </w:rPr>
+        <w:t xml:space="preserve">In the park and in games</w:t>
+      </w:r>
+      <w:r>
+        <w:rPr>
+          <w:rFonts w:ascii="Calibri" w:cs="Calibri" w:eastAsia="Calibri" w:hAnsi="Calibri"/>
+          <w:color w:val="1F2328"/>
+        </w:rPr>
+        <w:t xml:space="preserve">, a click or wheel over a panel, the pause menu or the phone belongs to that menu. It no longer zooms the camera, shoots or passes. The showroom zooms only with the wheel over the player, smoothly on a trackpad, and stops turning if a menu opens mid-drag. The button prompt no longer catches clicks.</w:t>
+      </w:r>
+    </w:p>
+    <w:p>
+      <w:pPr>
+        <w:spacing w:after="140" w:line="288"/>
+      </w:pPr>
+      <w:r>
+        <w:rPr>
+          <w:rFonts w:ascii="Calibri" w:cs="Calibri" w:eastAsia="Calibri" w:hAnsi="Calibri"/>
+          <w:b/>
+          <w:bCs/>
+          <w:color w:val="1F2328"/>
+        </w:rPr>
+        <w:t xml:space="preserve">Finishing at the rim.</w:t>
+      </w:r>
+      <w:r>
+        <w:rPr>
+          <w:rFonts w:ascii="Calibri" w:cs="Calibri" w:eastAsia="Calibri" w:hAnsi="Calibri"/>
+          <w:color w:val="1F2328"/>
+        </w:rPr>
+        <w:t xml:space="preserve"> The R2 + right stick down + Square combo is gone.</w:t>
+      </w:r>
+    </w:p>
+    <w:p>
+      <w:pPr>
+        <w:pStyle w:val="ListParagraph"/>
+        <w:numPr>
+          <w:ilvl w:val="0"/>
+          <w:numId w:val="2"/>
+        </w:numPr>
+        <w:spacing w:after="80" w:line="276"/>
+      </w:pPr>
+      <w:r>
+        <w:rPr>
+          <w:rFonts w:ascii="Calibri" w:cs="Calibri" w:eastAsia="Calibri" w:hAnsi="Calibri"/>
+          <w:b/>
+          <w:bCs/>
+          <w:color w:val="1F2328"/>
+        </w:rPr>
+        <w:t xml:space="preserve">Attack the rim now forces a dunk, with any build.</w:t>
+      </w:r>
+      <w:r>
+        <w:rPr>
+          <w:rFonts w:ascii="Calibri" w:cs="Calibri" w:eastAsia="Calibri" w:hAnsi="Calibri"/>
+          <w:color w:val="1F2328"/>
+        </w:rPr>
+        <w:t xml:space="preserve"> That's Z on the keyboard, or the right stick down while sprinting. The make, miss and block chances are the dunk's usual ones, and a build that can't normally dunk uses a basic dunk. Starting a little too far out, you keep driving until you're in range.</w:t>
+      </w:r>
+    </w:p>
+    <w:p>
+      <w:pPr>
+        <w:pStyle w:val="ListParagraph"/>
+        <w:numPr>
+          <w:ilvl w:val="0"/>
+          <w:numId w:val="2"/>
+        </w:numPr>
+        <w:spacing w:after="80" w:line="276"/>
+      </w:pPr>
+      <w:r>
+        <w:rPr>
+          <w:rFonts w:ascii="Calibri" w:cs="Calibri" w:eastAsia="Calibri" w:hAnsi="Calibri"/>
+          <w:b/>
+          <w:bCs/>
+          <w:color w:val="1F2328"/>
+        </w:rPr>
+        <w:t xml:space="preserve">Sprint + Shoot at the rim forces a layup.</w:t>
+      </w:r>
+      <w:r>
+        <w:rPr>
+          <w:rFonts w:ascii="Calibri" w:cs="Calibri" w:eastAsia="Calibri" w:hAnsi="Calibri"/>
+          <w:color w:val="1F2328"/>
+        </w:rPr>
+        <w:t xml:space="preserve"> It's never a dunk, jumper or pump fake. The layup is timed like a shot: a quick tap is an early layup. Anywhere else, Shoot works as before.</w:t>
+      </w:r>
+    </w:p>
+    <w:p>
+      <w:pPr>
+        <w:spacing w:after="140" w:line="288"/>
+      </w:pPr>
+      <w:r>
+        <w:rPr>
+          <w:rFonts w:ascii="Calibri" w:cs="Calibri" w:eastAsia="Calibri" w:hAnsi="Calibri"/>
+          <w:b/>
+          <w:bCs/>
+          <w:color w:val="1F2328"/>
+        </w:rPr>
+        <w:t xml:space="preserve">Emotes reach other players.</w:t>
+      </w:r>
+      <w:r>
+        <w:rPr>
+          <w:rFonts w:ascii="Calibri" w:cs="Calibri" w:eastAsia="Calibri" w:hAnsi="Calibri"/>
+          <w:color w:val="1F2328"/>
+        </w:rPr>
+        <w:t xml:space="preserve"> A celebration in the park or at the Crew HQ used to play only on your own screen. Now everyone there sees it on your player. The server checks that it's the celebration you actually have on. Games already showed them.</w:t>
+      </w:r>
+    </w:p>
+    <w:p>
+      <w:pPr>
+        <w:spacing w:after="140" w:line="288"/>
+      </w:pPr>
+      <w:r>
+        <w:rPr>
+          <w:rFonts w:ascii="Calibri" w:cs="Calibri" w:eastAsia="Calibri" w:hAnsi="Calibri"/>
+          <w:b/>
+          <w:bCs/>
+          <w:color w:val="1F2328"/>
+        </w:rPr>
+        <w:t xml:space="preserve">One park for everyone online.</w:t>
+      </w:r>
+    </w:p>
+    <w:p>
+      <w:pPr>
+        <w:pStyle w:val="ListParagraph"/>
+        <w:numPr>
+          <w:ilvl w:val="0"/>
+          <w:numId w:val="2"/>
+        </w:numPr>
+        <w:spacing w:after="80" w:line="276"/>
+      </w:pPr>
+      <w:r>
+        <w:rPr>
+          <w:rFonts w:ascii="Calibri" w:cs="Calibri" w:eastAsia="Calibri" w:hAnsi="Calibri"/>
+          <w:b/>
+          <w:bCs/>
+          <w:color w:val="1F2328"/>
+        </w:rPr>
+        <w:t xml:space="preserve">The server picks the park's host:</w:t>
+      </w:r>
+      <w:r>
+        <w:rPr>
+          <w:rFonts w:ascii="Calibri" w:cs="Calibri" w:eastAsia="Calibri" w:hAnsi="Calibri"/>
+          <w:color w:val="1F2328"/>
+        </w:rPr>
+        <w:t xml:space="preserve"> whoever has been at the park longest. A new arrival no longer takes over and resets the park.</w:t>
+      </w:r>
+    </w:p>
+    <w:p>
+      <w:pPr>
+        <w:pStyle w:val="ListParagraph"/>
+        <w:numPr>
+          <w:ilvl w:val="0"/>
+          <w:numId w:val="2"/>
+        </w:numPr>
+        <w:spacing w:after="80" w:line="276"/>
+      </w:pPr>
+      <w:r>
+        <w:rPr>
+          <w:rFonts w:ascii="Calibri" w:cs="Calibri" w:eastAsia="Calibri" w:hAnsi="Calibri"/>
+          <w:b/>
+          <w:bCs/>
+          <w:color w:val="1F2328"/>
+        </w:rPr>
+        <w:t xml:space="preserve">Only that host's updates go out</w:t>
+      </w:r>
+      <w:r>
+        <w:rPr>
+          <w:rFonts w:ascii="Calibri" w:cs="Calibri" w:eastAsia="Calibri" w:hAnsi="Calibri"/>
+          <w:color w:val="1F2328"/>
+        </w:rPr>
+        <w:t xml:space="preserve">, so two players can't both drive the park.</w:t>
+      </w:r>
+    </w:p>
+    <w:p>
+      <w:pPr>
+        <w:pStyle w:val="ListParagraph"/>
+        <w:numPr>
+          <w:ilvl w:val="0"/>
+          <w:numId w:val="2"/>
+        </w:numPr>
+        <w:spacing w:after="80" w:line="276"/>
+      </w:pPr>
+      <w:r>
+        <w:rPr>
+          <w:rFonts w:ascii="Calibri" w:cs="Calibri" w:eastAsia="Calibri" w:hAnsi="Calibri"/>
+          <w:b/>
+          <w:bCs/>
+          <w:color w:val="1F2328"/>
+        </w:rPr>
+        <w:t xml:space="preserve">A player who walks in sees the park as it is straight away.</w:t>
+      </w:r>
+    </w:p>
+    <w:p>
+      <w:pPr>
+        <w:spacing w:after="140" w:line="288"/>
+      </w:pPr>
+      <w:r>
+        <w:rPr>
+          <w:rFonts w:ascii="Calibri" w:cs="Calibri" w:eastAsia="Calibri" w:hAnsi="Calibri"/>
+          <w:b/>
+          <w:bCs/>
+          <w:color w:val="1F2328"/>
+        </w:rPr>
+        <w:t xml:space="preserve">Icon badge items belong to their Icon.</w:t>
+      </w:r>
+      <w:r>
+        <w:rPr>
+          <w:rFonts w:ascii="Calibri" w:cs="Calibri" w:eastAsia="Calibri" w:hAnsi="Calibri"/>
+          <w:color w:val="1F2328"/>
+        </w:rPr>
+        <w:t xml:space="preserve"> Each Icon badge's own animation items now show only on a build that has unlocked that badge. Other builds don't see them at all: no card, no count and no tab. They're never in the store, and they go on automatically when the badge unlocks. The items:</w:t>
+      </w:r>
+    </w:p>
+    <w:p>
+      <w:pPr>
+        <w:pStyle w:val="ListParagraph"/>
+        <w:numPr>
+          <w:ilvl w:val="0"/>
+          <w:numId w:val="2"/>
+        </w:numPr>
+        <w:spacing w:after="80" w:line="276"/>
+      </w:pPr>
+      <w:r>
+        <w:rPr>
+          <w:rFonts w:ascii="Calibri" w:cs="Calibri" w:eastAsia="Calibri" w:hAnsi="Calibri"/>
+          <w:color w:val="1F2328"/>
+        </w:rPr>
+        <w:t xml:space="preserve">Sharp Eye's jumpshot and release</w:t>
+      </w:r>
+    </w:p>
+    <w:p>
+      <w:pPr>
+        <w:pStyle w:val="ListParagraph"/>
+        <w:numPr>
+          <w:ilvl w:val="0"/>
+          <w:numId w:val="2"/>
+        </w:numPr>
+        <w:spacing w:after="80" w:line="276"/>
+      </w:pPr>
+      <w:r>
+        <w:rPr>
+          <w:rFonts w:ascii="Calibri" w:cs="Calibri" w:eastAsia="Calibri" w:hAnsi="Calibri"/>
+          <w:color w:val="1F2328"/>
+        </w:rPr>
+        <w:t xml:space="preserve">Hash-Slinging's dunk package (it used to show as a locked card on every build and in the store)</w:t>
+      </w:r>
+    </w:p>
+    <w:p>
+      <w:pPr>
+        <w:pStyle w:val="ListParagraph"/>
+        <w:numPr>
+          <w:ilvl w:val="0"/>
+          <w:numId w:val="2"/>
+        </w:numPr>
+        <w:spacing w:after="80" w:line="276"/>
+      </w:pPr>
+      <w:r>
+        <w:rPr>
+          <w:rFonts w:ascii="Calibri" w:cs="Calibri" w:eastAsia="Calibri" w:hAnsi="Calibri"/>
+          <w:color w:val="1F2328"/>
+        </w:rPr>
+        <w:t xml:space="preserve">The Clamp's Steal Package</w:t>
+      </w:r>
+    </w:p>
+    <w:p>
+      <w:pPr>
+        <w:pStyle w:val="ListParagraph"/>
+        <w:numPr>
+          <w:ilvl w:val="0"/>
+          <w:numId w:val="2"/>
+        </w:numPr>
+        <w:spacing w:after="80" w:line="276"/>
+      </w:pPr>
+      <w:r>
+        <w:rPr>
+          <w:rFonts w:ascii="Calibri" w:cs="Calibri" w:eastAsia="Calibri" w:hAnsi="Calibri"/>
+          <w:color w:val="1F2328"/>
+        </w:rPr>
+        <w:t xml:space="preserve">Big Brother's Block Package</w:t>
+      </w:r>
+    </w:p>
+    <w:p>
+      <w:pPr>
+        <w:pStyle w:val="ListParagraph"/>
+        <w:numPr>
+          <w:ilvl w:val="0"/>
+          <w:numId w:val="2"/>
+        </w:numPr>
+        <w:spacing w:after="80" w:line="276"/>
+      </w:pPr>
+      <w:r>
+        <w:rPr>
+          <w:rFonts w:ascii="Calibri" w:cs="Calibri" w:eastAsia="Calibri" w:hAnsi="Calibri"/>
+          <w:color w:val="1F2328"/>
+        </w:rPr>
+        <w:t xml:space="preserve">Open Arms' Rebound Package</w:t>
+      </w:r>
+    </w:p>
+    <w:p>
+      <w:pPr>
+        <w:pStyle w:val="ListParagraph"/>
+        <w:numPr>
+          <w:ilvl w:val="0"/>
+          <w:numId w:val="2"/>
+        </w:numPr>
+        <w:spacing w:after="80" w:line="276"/>
+      </w:pPr>
+      <w:r>
+        <w:rPr>
+          <w:rFonts w:ascii="Calibri" w:cs="Calibri" w:eastAsia="Calibri" w:hAnsi="Calibri"/>
+          <w:color w:val="1F2328"/>
+        </w:rPr>
+        <w:t xml:space="preserve">Sexy Red's Post Move Package</w:t>
+      </w:r>
+    </w:p>
+    <w:p>
+      <w:pPr>
+        <w:pStyle w:val="ListParagraph"/>
+        <w:numPr>
+          <w:ilvl w:val="0"/>
+          <w:numId w:val="2"/>
+        </w:numPr>
+        <w:spacing w:after="80" w:line="276"/>
+      </w:pPr>
+      <w:r>
+        <w:rPr>
+          <w:rFonts w:ascii="Calibri" w:cs="Calibri" w:eastAsia="Calibri" w:hAnsi="Calibri"/>
+          <w:color w:val="1F2328"/>
+        </w:rPr>
+        <w:t xml:space="preserve">The General's Salute</w:t>
+      </w:r>
+    </w:p>
+    <w:p>
+      <w:pPr>
+        <w:pStyle w:val="ListParagraph"/>
+        <w:numPr>
+          <w:ilvl w:val="0"/>
+          <w:numId w:val="2"/>
+        </w:numPr>
+        <w:spacing w:after="80" w:line="276"/>
+      </w:pPr>
+      <w:r>
+        <w:rPr>
+          <w:rFonts w:ascii="Calibri" w:cs="Calibri" w:eastAsia="Calibri" w:hAnsi="Calibri"/>
+          <w:b/>
+          <w:bCs/>
+          <w:color w:val="1F2328"/>
+        </w:rPr>
+        <w:t xml:space="preserve">New:</w:t>
+      </w:r>
+      <w:r>
+        <w:rPr>
+          <w:rFonts w:ascii="Calibri" w:cs="Calibri" w:eastAsia="Calibri" w:hAnsi="Calibri"/>
+          <w:color w:val="1F2328"/>
+        </w:rPr>
+        <w:t xml:space="preserve"> Oprah's </w:t>
+      </w:r>
+      <w:r>
+        <w:rPr>
+          <w:rFonts w:ascii="Calibri" w:cs="Calibri" w:eastAsia="Calibri" w:hAnsi="Calibri"/>
+          <w:b/>
+          <w:bCs/>
+          <w:color w:val="1F2328"/>
+        </w:rPr>
+        <w:t xml:space="preserve">Pass Package: Oprah</w:t>
+      </w:r>
+      <w:r>
+        <w:rPr>
+          <w:rFonts w:ascii="Calibri" w:cs="Calibri" w:eastAsia="Calibri" w:hAnsi="Calibri"/>
+          <w:color w:val="1F2328"/>
+        </w:rPr>
+        <w:t xml:space="preserve">, under a Passes tab that only a Playmaker with Oprah unlocked has.</w:t>
+      </w:r>
+    </w:p>
+    <w:p>
+      <w:pPr>
+        <w:spacing w:after="140" w:line="288"/>
+      </w:pPr>
+      <w:r>
+        <w:rPr>
+          <w:rFonts w:ascii="Calibri" w:cs="Calibri" w:eastAsia="Calibri" w:hAnsi="Calibri"/>
+          <w:b/>
+          <w:bCs/>
+          <w:color w:val="1F2328"/>
+        </w:rPr>
+        <w:t xml:space="preserve">Icon badges show on screen when they make the play.</w:t>
+      </w:r>
+      <w:r>
+        <w:rPr>
+          <w:rFonts w:ascii="Calibri" w:cs="Calibri" w:eastAsia="Calibri" w:hAnsi="Calibri"/>
+          <w:color w:val="1F2328"/>
+        </w:rPr>
+        <w:t xml:space="preserve"> Each Icon badge now pops up on screen, the way Hash-Slinging does, whenever it's behind the play:</w:t>
+      </w:r>
+    </w:p>
+    <w:tbl>
+      <w:tblPr>
+        <w:tblW w:type="dxa" w:w="9360"/>
+        <w:tblBorders>
+          <w:top w:val="single" w:color="auto" w:sz="4"/>
+          <w:left w:val="single" w:color="auto" w:sz="4"/>
+          <w:bottom w:val="single" w:color="auto" w:sz="4"/>
+          <w:right w:val="single" w:color="auto" w:sz="4"/>
+          <w:insideH w:val="single" w:color="auto" w:sz="4"/>
+          <w:insideV w:val="single" w:color="auto" w:sz="4"/>
+        </w:tblBorders>
+      </w:tblPr>
+      <w:tblGrid>
+        <w:gridCol w:w="1308"/>
+        <w:gridCol w:w="8052"/>
+      </w:tblGrid>
+      <w:tr>
+        <w:trPr>
+          <w:cantSplit/>
+          <w:tblHeader/>
+        </w:trPr>
+        <w:tc>
+          <w:tcPr>
+            <w:tcW w:type="dxa" w:w="1308"/>
+            <w:tcBorders>
+              <w:top w:val="single" w:color="D0D7DE" w:sz="4"/>
+              <w:left w:val="single" w:color="D0D7DE" w:sz="4"/>
+              <w:bottom w:val="single" w:color="D0D7DE" w:sz="4"/>
+              <w:right w:val="single" w:color="D0D7DE" w:sz="4"/>
+            </w:tcBorders>
+            <w:shd w:fill="F3E3E6" w:color="auto" w:val="clear"/>
+            <w:tcMar>
+              <w:top w:type="dxa" w:w="60"/>
+              <w:left w:type="dxa" w:w="100"/>
+              <w:bottom w:type="dxa" w:w="60"/>
+              <w:right w:type="dxa" w:w="100"/>
+            </w:tcMar>
+          </w:tcPr>
+          <w:p>
+            <w:pPr>
+              <w:jc w:val="left"/>
+            </w:pPr>
+            <w:r>
+              <w:rPr>
+                <w:rFonts w:ascii="Calibri" w:cs="Calibri" w:eastAsia="Calibri" w:hAnsi="Calibri"/>
+                <w:b/>
+                <w:bCs/>
+                <w:color w:val="1F2328"/>
+              </w:rPr>
+              <w:t xml:space="preserve">Badge</w:t>
+            </w:r>
+          </w:p>
+        </w:tc>
+        <w:tc>
+          <w:tcPr>
+            <w:tcW w:type="dxa" w:w="8052"/>
+            <w:tcBorders>
+              <w:top w:val="single" w:color="D0D7DE" w:sz="4"/>
+              <w:left w:val="single" w:color="D0D7DE" w:sz="4"/>
+              <w:bottom w:val="single" w:color="D0D7DE" w:sz="4"/>
+              <w:right w:val="single" w:color="D0D7DE" w:sz="4"/>
+            </w:tcBorders>
+            <w:shd w:fill="F3E3E6" w:color="auto" w:val="clear"/>
+            <w:tcMar>
+              <w:top w:type="dxa" w:w="60"/>
+              <w:left w:type="dxa" w:w="100"/>
+              <w:bottom w:type="dxa" w:w="60"/>
+              <w:right w:type="dxa" w:w="100"/>
+            </w:tcMar>
+          </w:tcPr>
+          <w:p>
+            <w:pPr>
+              <w:jc w:val="left"/>
+            </w:pPr>
+            <w:r>
+              <w:rPr>
+                <w:rFonts w:ascii="Calibri" w:cs="Calibri" w:eastAsia="Calibri" w:hAnsi="Calibri"/>
+                <w:b/>
+                <w:bCs/>
+                <w:color w:val="1F2328"/>
+              </w:rPr>
+              <w:t xml:space="preserve">Pops when</w:t>
+            </w:r>
+          </w:p>
+        </w:tc>
+      </w:tr>
+      <w:tr>
+        <w:trPr>
+          <w:cantSplit/>
+          <w:tblHeader w:val="false"/>
+        </w:trPr>
+        <w:tc>
+          <w:tcPr>
+            <w:tcW w:type="dxa" w:w="1308"/>
+            <w:tcBorders>
+              <w:top w:val="single" w:color="D0D7DE" w:sz="4"/>
+              <w:left w:val="single" w:color="D0D7DE" w:sz="4"/>
+              <w:bottom w:val="single" w:color="D0D7DE" w:sz="4"/>
+              <w:right w:val="single" w:color="D0D7DE" w:sz="4"/>
+            </w:tcBorders>
+            <w:tcMar>
+              <w:top w:type="dxa" w:w="60"/>
+              <w:left w:type="dxa" w:w="100"/>
+              <w:bottom w:type="dxa" w:w="60"/>
+              <w:right w:type="dxa" w:w="100"/>
+            </w:tcMar>
+          </w:tcPr>
+          <w:p>
+            <w:pPr>
+              <w:jc w:val="left"/>
+            </w:pPr>
+            <w:r>
+              <w:rPr>
+                <w:rFonts w:ascii="Calibri" w:cs="Calibri" w:eastAsia="Calibri" w:hAnsi="Calibri"/>
+                <w:color w:val="1F2328"/>
+              </w:rPr>
+              <w:t xml:space="preserve">Sharp Eye</w:t>
+            </w:r>
+          </w:p>
+        </w:tc>
+        <w:tc>
+          <w:tcPr>
+            <w:tcW w:type="dxa" w:w="8052"/>
+            <w:tcBorders>
+              <w:top w:val="single" w:color="D0D7DE" w:sz="4"/>
+              <w:left w:val="single" w:color="D0D7DE" w:sz="4"/>
+              <w:bottom w:val="single" w:color="D0D7DE" w:sz="4"/>
+              <w:right w:val="single" w:color="D0D7DE" w:sz="4"/>
+            </w:tcBorders>
+            <w:tcMar>
+              <w:top w:type="dxa" w:w="60"/>
+              <w:left w:type="dxa" w:w="100"/>
+              <w:bottom w:type="dxa" w:w="60"/>
+              <w:right w:type="dxa" w:w="100"/>
+            </w:tcMar>
+          </w:tcPr>
+          <w:p>
+            <w:pPr>
+              <w:jc w:val="left"/>
+            </w:pPr>
+            <w:r>
+              <w:rPr>
+                <w:rFonts w:ascii="Calibri" w:cs="Calibri" w:eastAsia="Calibri" w:hAnsi="Calibri"/>
+                <w:color w:val="1F2328"/>
+              </w:rPr>
+              <w:t xml:space="preserve">A made jumper with its own jumpshot or release, or a green only its bigger window gave</w:t>
+            </w:r>
+          </w:p>
+        </w:tc>
+      </w:tr>
+      <w:tr>
+        <w:trPr>
+          <w:cantSplit/>
+          <w:tblHeader w:val="false"/>
+        </w:trPr>
+        <w:tc>
+          <w:tcPr>
+            <w:tcW w:type="dxa" w:w="1308"/>
+            <w:tcBorders>
+              <w:top w:val="single" w:color="D0D7DE" w:sz="4"/>
+              <w:left w:val="single" w:color="D0D7DE" w:sz="4"/>
+              <w:bottom w:val="single" w:color="D0D7DE" w:sz="4"/>
+              <w:right w:val="single" w:color="D0D7DE" w:sz="4"/>
+            </w:tcBorders>
+            <w:tcMar>
+              <w:top w:type="dxa" w:w="60"/>
+              <w:left w:type="dxa" w:w="100"/>
+              <w:bottom w:type="dxa" w:w="60"/>
+              <w:right w:type="dxa" w:w="100"/>
+            </w:tcMar>
+          </w:tcPr>
+          <w:p>
+            <w:pPr>
+              <w:jc w:val="left"/>
+            </w:pPr>
+            <w:r>
+              <w:rPr>
+                <w:rFonts w:ascii="Calibri" w:cs="Calibri" w:eastAsia="Calibri" w:hAnsi="Calibri"/>
+                <w:color w:val="1F2328"/>
+              </w:rPr>
+              <w:t xml:space="preserve">Hash-Slinging</w:t>
+            </w:r>
+          </w:p>
+        </w:tc>
+        <w:tc>
+          <w:tcPr>
+            <w:tcW w:type="dxa" w:w="8052"/>
+            <w:tcBorders>
+              <w:top w:val="single" w:color="D0D7DE" w:sz="4"/>
+              <w:left w:val="single" w:color="D0D7DE" w:sz="4"/>
+              <w:bottom w:val="single" w:color="D0D7DE" w:sz="4"/>
+              <w:right w:val="single" w:color="D0D7DE" w:sz="4"/>
+            </w:tcBorders>
+            <w:tcMar>
+              <w:top w:type="dxa" w:w="60"/>
+              <w:left w:type="dxa" w:w="100"/>
+              <w:bottom w:type="dxa" w:w="60"/>
+              <w:right w:type="dxa" w:w="100"/>
+            </w:tcMar>
+          </w:tcPr>
+          <w:p>
+            <w:pPr>
+              <w:jc w:val="left"/>
+            </w:pPr>
+            <w:r>
+              <w:rPr>
+                <w:rFonts w:ascii="Calibri" w:cs="Calibri" w:eastAsia="Calibri" w:hAnsi="Calibri"/>
+                <w:color w:val="1F2328"/>
+              </w:rPr>
+              <w:t xml:space="preserve">A made dunk</w:t>
+            </w:r>
+          </w:p>
+        </w:tc>
+      </w:tr>
+      <w:tr>
+        <w:trPr>
+          <w:cantSplit/>
+          <w:tblHeader w:val="false"/>
+        </w:trPr>
+        <w:tc>
+          <w:tcPr>
+            <w:tcW w:type="dxa" w:w="1308"/>
+            <w:tcBorders>
+              <w:top w:val="single" w:color="D0D7DE" w:sz="4"/>
+              <w:left w:val="single" w:color="D0D7DE" w:sz="4"/>
+              <w:bottom w:val="single" w:color="D0D7DE" w:sz="4"/>
+              <w:right w:val="single" w:color="D0D7DE" w:sz="4"/>
+            </w:tcBorders>
+            <w:tcMar>
+              <w:top w:type="dxa" w:w="60"/>
+              <w:left w:type="dxa" w:w="100"/>
+              <w:bottom w:type="dxa" w:w="60"/>
+              <w:right w:type="dxa" w:w="100"/>
+            </w:tcMar>
+          </w:tcPr>
+          <w:p>
+            <w:pPr>
+              <w:jc w:val="left"/>
+            </w:pPr>
+            <w:r>
+              <w:rPr>
+                <w:rFonts w:ascii="Calibri" w:cs="Calibri" w:eastAsia="Calibri" w:hAnsi="Calibri"/>
+                <w:color w:val="1F2328"/>
+              </w:rPr>
+              <w:t xml:space="preserve">Oprah</w:t>
+            </w:r>
+          </w:p>
+        </w:tc>
+        <w:tc>
+          <w:tcPr>
+            <w:tcW w:type="dxa" w:w="8052"/>
+            <w:tcBorders>
+              <w:top w:val="single" w:color="D0D7DE" w:sz="4"/>
+              <w:left w:val="single" w:color="D0D7DE" w:sz="4"/>
+              <w:bottom w:val="single" w:color="D0D7DE" w:sz="4"/>
+              <w:right w:val="single" w:color="D0D7DE" w:sz="4"/>
+            </w:tcBorders>
+            <w:tcMar>
+              <w:top w:type="dxa" w:w="60"/>
+              <w:left w:type="dxa" w:w="100"/>
+              <w:bottom w:type="dxa" w:w="60"/>
+              <w:right w:type="dxa" w:w="100"/>
+            </w:tcMar>
+          </w:tcPr>
+          <w:p>
+            <w:pPr>
+              <w:jc w:val="left"/>
+            </w:pPr>
+            <w:r>
+              <w:rPr>
+                <w:rFonts w:ascii="Calibri" w:cs="Calibri" w:eastAsia="Calibri" w:hAnsi="Calibri"/>
+                <w:color w:val="1F2328"/>
+              </w:rPr>
+              <w:t xml:space="preserve">A pass (every one of his passes is an Oprah pass)</w:t>
+            </w:r>
+          </w:p>
+        </w:tc>
+      </w:tr>
+      <w:tr>
+        <w:trPr>
+          <w:cantSplit/>
+          <w:tblHeader w:val="false"/>
+        </w:trPr>
+        <w:tc>
+          <w:tcPr>
+            <w:tcW w:type="dxa" w:w="1308"/>
+            <w:tcBorders>
+              <w:top w:val="single" w:color="D0D7DE" w:sz="4"/>
+              <w:left w:val="single" w:color="D0D7DE" w:sz="4"/>
+              <w:bottom w:val="single" w:color="D0D7DE" w:sz="4"/>
+              <w:right w:val="single" w:color="D0D7DE" w:sz="4"/>
+            </w:tcBorders>
+            <w:tcMar>
+              <w:top w:type="dxa" w:w="60"/>
+              <w:left w:type="dxa" w:w="100"/>
+              <w:bottom w:type="dxa" w:w="60"/>
+              <w:right w:type="dxa" w:w="100"/>
+            </w:tcMar>
+          </w:tcPr>
+          <w:p>
+            <w:pPr>
+              <w:jc w:val="left"/>
+            </w:pPr>
+            <w:r>
+              <w:rPr>
+                <w:rFonts w:ascii="Calibri" w:cs="Calibri" w:eastAsia="Calibri" w:hAnsi="Calibri"/>
+                <w:color w:val="1F2328"/>
+              </w:rPr>
+              <w:t xml:space="preserve">The Clamp</w:t>
+            </w:r>
+          </w:p>
+        </w:tc>
+        <w:tc>
+          <w:tcPr>
+            <w:tcW w:type="dxa" w:w="8052"/>
+            <w:tcBorders>
+              <w:top w:val="single" w:color="D0D7DE" w:sz="4"/>
+              <w:left w:val="single" w:color="D0D7DE" w:sz="4"/>
+              <w:bottom w:val="single" w:color="D0D7DE" w:sz="4"/>
+              <w:right w:val="single" w:color="D0D7DE" w:sz="4"/>
+            </w:tcBorders>
+            <w:tcMar>
+              <w:top w:type="dxa" w:w="60"/>
+              <w:left w:type="dxa" w:w="100"/>
+              <w:bottom w:type="dxa" w:w="60"/>
+              <w:right w:type="dxa" w:w="100"/>
+            </w:tcMar>
+          </w:tcPr>
+          <w:p>
+            <w:pPr>
+              <w:jc w:val="left"/>
+            </w:pPr>
+            <w:r>
+              <w:rPr>
+                <w:rFonts w:ascii="Calibri" w:cs="Calibri" w:eastAsia="Calibri" w:hAnsi="Calibri"/>
+                <w:color w:val="1F2328"/>
+              </w:rPr>
+              <w:t xml:space="preserve">One of its steal reaches, pick-offs or strips</w:t>
+            </w:r>
+          </w:p>
+        </w:tc>
+      </w:tr>
+      <w:tr>
+        <w:trPr>
+          <w:cantSplit/>
+          <w:tblHeader w:val="false"/>
+        </w:trPr>
+        <w:tc>
+          <w:tcPr>
+            <w:tcW w:type="dxa" w:w="1308"/>
+            <w:tcBorders>
+              <w:top w:val="single" w:color="D0D7DE" w:sz="4"/>
+              <w:left w:val="single" w:color="D0D7DE" w:sz="4"/>
+              <w:bottom w:val="single" w:color="D0D7DE" w:sz="4"/>
+              <w:right w:val="single" w:color="D0D7DE" w:sz="4"/>
+            </w:tcBorders>
+            <w:tcMar>
+              <w:top w:type="dxa" w:w="60"/>
+              <w:left w:type="dxa" w:w="100"/>
+              <w:bottom w:type="dxa" w:w="60"/>
+              <w:right w:type="dxa" w:w="100"/>
+            </w:tcMar>
+          </w:tcPr>
+          <w:p>
+            <w:pPr>
+              <w:jc w:val="left"/>
+            </w:pPr>
+            <w:r>
+              <w:rPr>
+                <w:rFonts w:ascii="Calibri" w:cs="Calibri" w:eastAsia="Calibri" w:hAnsi="Calibri"/>
+                <w:color w:val="1F2328"/>
+              </w:rPr>
+              <w:t xml:space="preserve">The General</w:t>
+            </w:r>
+          </w:p>
+        </w:tc>
+        <w:tc>
+          <w:tcPr>
+            <w:tcW w:type="dxa" w:w="8052"/>
+            <w:tcBorders>
+              <w:top w:val="single" w:color="D0D7DE" w:sz="4"/>
+              <w:left w:val="single" w:color="D0D7DE" w:sz="4"/>
+              <w:bottom w:val="single" w:color="D0D7DE" w:sz="4"/>
+              <w:right w:val="single" w:color="D0D7DE" w:sz="4"/>
+            </w:tcBorders>
+            <w:tcMar>
+              <w:top w:type="dxa" w:w="60"/>
+              <w:left w:type="dxa" w:w="100"/>
+              <w:bottom w:type="dxa" w:w="60"/>
+              <w:right w:type="dxa" w:w="100"/>
+            </w:tcMar>
+          </w:tcPr>
+          <w:p>
+            <w:pPr>
+              <w:jc w:val="left"/>
+            </w:pPr>
+            <w:r>
+              <w:rPr>
+                <w:rFonts w:ascii="Calibri" w:cs="Calibri" w:eastAsia="Calibri" w:hAnsi="Calibri"/>
+                <w:color w:val="1F2328"/>
+              </w:rPr>
+              <w:t xml:space="preserve">A made basket, a block or a steal</w:t>
+            </w:r>
+          </w:p>
+        </w:tc>
+      </w:tr>
+      <w:tr>
+        <w:trPr>
+          <w:cantSplit/>
+          <w:tblHeader w:val="false"/>
+        </w:trPr>
+        <w:tc>
+          <w:tcPr>
+            <w:tcW w:type="dxa" w:w="1308"/>
+            <w:tcBorders>
+              <w:top w:val="single" w:color="D0D7DE" w:sz="4"/>
+              <w:left w:val="single" w:color="D0D7DE" w:sz="4"/>
+              <w:bottom w:val="single" w:color="D0D7DE" w:sz="4"/>
+              <w:right w:val="single" w:color="D0D7DE" w:sz="4"/>
+            </w:tcBorders>
+            <w:tcMar>
+              <w:top w:type="dxa" w:w="60"/>
+              <w:left w:type="dxa" w:w="100"/>
+              <w:bottom w:type="dxa" w:w="60"/>
+              <w:right w:type="dxa" w:w="100"/>
+            </w:tcMar>
+          </w:tcPr>
+          <w:p>
+            <w:pPr>
+              <w:jc w:val="left"/>
+            </w:pPr>
+            <w:r>
+              <w:rPr>
+                <w:rFonts w:ascii="Calibri" w:cs="Calibri" w:eastAsia="Calibri" w:hAnsi="Calibri"/>
+                <w:color w:val="1F2328"/>
+              </w:rPr>
+              <w:t xml:space="preserve">Big Brother</w:t>
+            </w:r>
+          </w:p>
+        </w:tc>
+        <w:tc>
+          <w:tcPr>
+            <w:tcW w:type="dxa" w:w="8052"/>
+            <w:tcBorders>
+              <w:top w:val="single" w:color="D0D7DE" w:sz="4"/>
+              <w:left w:val="single" w:color="D0D7DE" w:sz="4"/>
+              <w:bottom w:val="single" w:color="D0D7DE" w:sz="4"/>
+              <w:right w:val="single" w:color="D0D7DE" w:sz="4"/>
+            </w:tcBorders>
+            <w:tcMar>
+              <w:top w:type="dxa" w:w="60"/>
+              <w:left w:type="dxa" w:w="100"/>
+              <w:bottom w:type="dxa" w:w="60"/>
+              <w:right w:type="dxa" w:w="100"/>
+            </w:tcMar>
+          </w:tcPr>
+          <w:p>
+            <w:pPr>
+              <w:jc w:val="left"/>
+            </w:pPr>
+            <w:r>
+              <w:rPr>
+                <w:rFonts w:ascii="Calibri" w:cs="Calibri" w:eastAsia="Calibri" w:hAnsi="Calibri"/>
+                <w:color w:val="1F2328"/>
+              </w:rPr>
+              <w:t xml:space="preserve">A block from his Block Package</w:t>
+            </w:r>
+          </w:p>
+        </w:tc>
+      </w:tr>
+      <w:tr>
+        <w:trPr>
+          <w:cantSplit/>
+          <w:tblHeader w:val="false"/>
+        </w:trPr>
+        <w:tc>
+          <w:tcPr>
+            <w:tcW w:type="dxa" w:w="1308"/>
+            <w:tcBorders>
+              <w:top w:val="single" w:color="D0D7DE" w:sz="4"/>
+              <w:left w:val="single" w:color="D0D7DE" w:sz="4"/>
+              <w:bottom w:val="single" w:color="D0D7DE" w:sz="4"/>
+              <w:right w:val="single" w:color="D0D7DE" w:sz="4"/>
+            </w:tcBorders>
+            <w:tcMar>
+              <w:top w:type="dxa" w:w="60"/>
+              <w:left w:type="dxa" w:w="100"/>
+              <w:bottom w:type="dxa" w:w="60"/>
+              <w:right w:type="dxa" w:w="100"/>
+            </w:tcMar>
+          </w:tcPr>
+          <w:p>
+            <w:pPr>
+              <w:jc w:val="left"/>
+            </w:pPr>
+            <w:r>
+              <w:rPr>
+                <w:rFonts w:ascii="Calibri" w:cs="Calibri" w:eastAsia="Calibri" w:hAnsi="Calibri"/>
+                <w:color w:val="1F2328"/>
+              </w:rPr>
+              <w:t xml:space="preserve">Open Arms</w:t>
+            </w:r>
+          </w:p>
+        </w:tc>
+        <w:tc>
+          <w:tcPr>
+            <w:tcW w:type="dxa" w:w="8052"/>
+            <w:tcBorders>
+              <w:top w:val="single" w:color="D0D7DE" w:sz="4"/>
+              <w:left w:val="single" w:color="D0D7DE" w:sz="4"/>
+              <w:bottom w:val="single" w:color="D0D7DE" w:sz="4"/>
+              <w:right w:val="single" w:color="D0D7DE" w:sz="4"/>
+            </w:tcBorders>
+            <w:tcMar>
+              <w:top w:type="dxa" w:w="60"/>
+              <w:left w:type="dxa" w:w="100"/>
+              <w:bottom w:type="dxa" w:w="60"/>
+              <w:right w:type="dxa" w:w="100"/>
+            </w:tcMar>
+          </w:tcPr>
+          <w:p>
+            <w:pPr>
+              <w:jc w:val="left"/>
+            </w:pPr>
+            <w:r>
+              <w:rPr>
+                <w:rFonts w:ascii="Calibri" w:cs="Calibri" w:eastAsia="Calibri" w:hAnsi="Calibri"/>
+                <w:color w:val="1F2328"/>
+              </w:rPr>
+              <w:t xml:space="preserve">A rebound snag</w:t>
+            </w:r>
+          </w:p>
+        </w:tc>
+      </w:tr>
+      <w:tr>
+        <w:trPr>
+          <w:cantSplit/>
+          <w:tblHeader w:val="false"/>
+        </w:trPr>
+        <w:tc>
+          <w:tcPr>
+            <w:tcW w:type="dxa" w:w="1308"/>
+            <w:tcBorders>
+              <w:top w:val="single" w:color="D0D7DE" w:sz="4"/>
+              <w:left w:val="single" w:color="D0D7DE" w:sz="4"/>
+              <w:bottom w:val="single" w:color="D0D7DE" w:sz="4"/>
+              <w:right w:val="single" w:color="D0D7DE" w:sz="4"/>
+            </w:tcBorders>
+            <w:tcMar>
+              <w:top w:type="dxa" w:w="60"/>
+              <w:left w:type="dxa" w:w="100"/>
+              <w:bottom w:type="dxa" w:w="60"/>
+              <w:right w:type="dxa" w:w="100"/>
+            </w:tcMar>
+          </w:tcPr>
+          <w:p>
+            <w:pPr>
+              <w:jc w:val="left"/>
+            </w:pPr>
+            <w:r>
+              <w:rPr>
+                <w:rFonts w:ascii="Calibri" w:cs="Calibri" w:eastAsia="Calibri" w:hAnsi="Calibri"/>
+                <w:color w:val="1F2328"/>
+              </w:rPr>
+              <w:t xml:space="preserve">Sexy Red</w:t>
+            </w:r>
+          </w:p>
+        </w:tc>
+        <w:tc>
+          <w:tcPr>
+            <w:tcW w:type="dxa" w:w="8052"/>
+            <w:tcBorders>
+              <w:top w:val="single" w:color="D0D7DE" w:sz="4"/>
+              <w:left w:val="single" w:color="D0D7DE" w:sz="4"/>
+              <w:bottom w:val="single" w:color="D0D7DE" w:sz="4"/>
+              <w:right w:val="single" w:color="D0D7DE" w:sz="4"/>
+            </w:tcBorders>
+            <w:tcMar>
+              <w:top w:type="dxa" w:w="60"/>
+              <w:left w:type="dxa" w:w="100"/>
+              <w:bottom w:type="dxa" w:w="60"/>
+              <w:right w:type="dxa" w:w="100"/>
+            </w:tcMar>
+          </w:tcPr>
+          <w:p>
+            <w:pPr>
+              <w:jc w:val="left"/>
+            </w:pPr>
+            <w:r>
+              <w:rPr>
+                <w:rFonts w:ascii="Calibri" w:cs="Calibri" w:eastAsia="Calibri" w:hAnsi="Calibri"/>
+                <w:color w:val="1F2328"/>
+              </w:rPr>
+              <w:t xml:space="preserve">A post move, post finish or post shot with her Post Move Package on</w:t>
+            </w:r>
+          </w:p>
+        </w:tc>
+      </w:tr>
+    </w:tbl>
+    <w:p>
+      <w:pPr>
+        <w:spacing w:after="80"/>
+      </w:pPr>
+    </w:p>
+    <w:p>
+      <w:pPr>
+        <w:spacing w:after="140" w:line="288"/>
+      </w:pPr>
+      <w:r>
+        <w:rPr>
+          <w:rFonts w:ascii="Calibri" w:cs="Calibri" w:eastAsia="Calibri" w:hAnsi="Calibri"/>
+          <w:color w:val="1F2328"/>
+        </w:rPr>
+        <w:t xml:space="preserve">The pop shows for every player in the game, AI ICONs and other players included, with the player's name when it isn't you. Each badge pops at most once every 1.5 s per player.</w:t>
+      </w:r>
+    </w:p>
     <w:sectPr>
       <w:pgSz w:w="12240" w:h="15840" w:orient="portrait"/>
       <w:pgMar w:top="1440" w:right="1440" w:bottom="1440" w:left="1440" w:header="708" w:footer="708" w:gutter="0"/>

</xml_diff>